<commit_message>
docs(d1): align submission package with claim workflow
</commit_message>
<xml_diff>
--- a/D1-FINAL/01_Submission/MedBill_D1_Report.docx
+++ b/D1-FINAL/01_Submission/MedBill_D1_Report.docx
@@ -61,15 +61,7 @@
         </w:rPr>
       </w:pPr>
       <w:r>
-        <w:rPr>
-          <w:rFonts w:eastAsia="Calibri"/>
-          <w:b/>
-          <w:bCs/>
-          <w:color w:val="000000"/>
-          <w:sz w:val="36"/>
-          <w:szCs w:val="36"/>
-        </w:rPr>
-        <w:t>Product Backlog and Definition of Done</w:t>
+        <w:t>Claim Intake Validation and CMS Preview</w:t>
       </w:r>
     </w:p>
     <w:p>
@@ -1608,7 +1600,7 @@
                 <w:noProof/>
                 <w:webHidden/>
               </w:rPr>
-              <w:t>3</w:t>
+              <w:t>4</w:t>
             </w:r>
             <w:r>
               <w:rPr>
@@ -1676,7 +1668,7 @@
                 <w:noProof/>
                 <w:webHidden/>
               </w:rPr>
-              <w:t>4</w:t>
+              <w:t>5</w:t>
             </w:r>
             <w:r>
               <w:rPr>
@@ -1744,7 +1736,7 @@
                 <w:noProof/>
                 <w:webHidden/>
               </w:rPr>
-              <w:t>5</w:t>
+              <w:t>6</w:t>
             </w:r>
             <w:r>
               <w:rPr>
@@ -2174,11 +2166,7 @@
         <w:spacing w:after="100" w:line="269" w:lineRule="auto"/>
       </w:pPr>
       <w:r>
-        <w:rPr>
-          <w:rFonts w:ascii="Times New Roman" w:hAnsi="Times New Roman"/>
-          <w:sz w:val="21"/>
-        </w:rPr>
-        <w:t>MedBill is a medical billing project for small clinics and billing teams. Our current D1 increment demonstrates the PDF verification part: upload or select documents, extract their text, check claim fields, obtain text-only AI assistance, and route the original PDFs to clear output folders.</w:t>
+        <w:t>MedBill is a medical billing project for small clinics and billing teams. Our D1 increment implements the first usable claim-intake slice: a biller signs in, creates a claim manually or from a PDF, reviews the patient, insurance and service fields, runs explainable checks, saves the validated draft and opens a CMS-1500-style preview.</w:t>
       </w:r>
     </w:p>
     <w:p>
@@ -2186,21 +2174,7 @@
         <w:spacing w:after="100" w:line="269" w:lineRule="auto"/>
       </w:pPr>
       <w:r>
-        <w:rPr>
-          <w:rFonts w:ascii="Times New Roman" w:hAnsi="Times New Roman"/>
-          <w:b/>
-          <w:sz w:val="21"/>
-        </w:rPr>
-        <w:t>Problem.</w:t>
-      </w:r>
-      <w:r>
-        <w:rPr>
-          <w:rFonts w:ascii="Times New Roman" w:hAnsi="Times New Roman"/>
-          <w:b w:val="0"/>
-          <w:sz w:val="21"/>
-          <w:bCs w:val="0"/>
-        </w:rPr>
-        <w:t xml:space="preserve"> Reviewing claim PDFs manually makes missing identifiers, unclear codes and incomplete provider details easy to overlook. Billing teams need an inspectable document-processing flow before adding a complete patient-to-payment system.</w:t>
+        <w:t>Problem. Claim information arrives in different forms, and manual re-entry can miss patient identifiers, insurance details, dates, diagnosis codes, procedure codes and charges. D1 needs one inspectable path that turns this information into a structured draft without claiming that the whole billing lifecycle is complete.</w:t>
       </w:r>
     </w:p>
     <w:p>
@@ -2208,21 +2182,7 @@
         <w:spacing w:after="100" w:line="269" w:lineRule="auto"/>
       </w:pPr>
       <w:r>
-        <w:rPr>
-          <w:rFonts w:ascii="Times New Roman" w:hAnsi="Times New Roman"/>
-          <w:b/>
-          <w:sz w:val="21"/>
-        </w:rPr>
-        <w:t>Target users.</w:t>
-      </w:r>
-      <w:r>
-        <w:rPr>
-          <w:rFonts w:ascii="Times New Roman" w:hAnsi="Times New Roman"/>
-          <w:b w:val="0"/>
-          <w:sz w:val="21"/>
-          <w:bCs w:val="0"/>
-        </w:rPr>
-        <w:t xml:space="preserve"> Billing staff and supervisors review synthetic claim documents in this public, login-free demonstration. Real patient records must not be uploaded. Authentication and accountable roles remain required for a private operational release.</w:t>
+        <w:t>Target users. A biller creates and reviews synthetic draft claims. An admin can also open the preserved technical PDF workspace. Signed sessions and role checks protect the claim and document APIs. The public demonstration must still use synthetic data only.</w:t>
       </w:r>
     </w:p>
     <w:p>
@@ -2230,21 +2190,7 @@
         <w:spacing w:after="100" w:line="269" w:lineRule="auto"/>
       </w:pPr>
       <w:r>
-        <w:rPr>
-          <w:rFonts w:ascii="Times New Roman" w:hAnsi="Times New Roman"/>
-          <w:b/>
-          <w:sz w:val="21"/>
-        </w:rPr>
-        <w:t>D1 solution.</w:t>
-      </w:r>
-      <w:r>
-        <w:rPr>
-          <w:rFonts w:ascii="Times New Roman" w:hAnsi="Times New Roman"/>
-          <w:b w:val="0"/>
-          <w:sz w:val="21"/>
-          <w:bCs w:val="0"/>
-        </w:rPr>
-        <w:t xml:space="preserve"> We provide one working upload-to-results flow, plus a step-by-step debug mode. PostgreSQL stores metadata and reports; R2 stores PDFs and backups. Accepted means the current technical checks passed, not that an insurer approved the claim.</w:t>
+        <w:t>D1 solution. Both input paths lead to the same editable claim, deterministic validation result, PostgreSQL record and printable CMS-1500-style preview. A validated draft means the required D1 format and presence checks passed; it does not mean a payer accepted the claim.</w:t>
       </w:r>
     </w:p>
     <w:p>
@@ -2269,11 +2215,7 @@
         <w:spacing w:after="100" w:line="269" w:lineRule="auto"/>
       </w:pPr>
       <w:r>
-        <w:rPr>
-          <w:rFonts w:ascii="Times New Roman" w:hAnsi="Times New Roman"/>
-          <w:sz w:val="21"/>
-        </w:rPr>
-        <w:t>One Next.js application serves both the React interface and Node.js API routes on Vercel. The backend reads PDFs from R2, performs extraction or Tesseract OCR, applies deterministic checks, calls Gemini with extracted text, and moves the original PDF. Ollama Cloud is a fallback. Prisma persists document and debug state in Supabase PostgreSQL.</w:t>
+        <w:t>One Next.js application serves the React interface and Node.js Route Handlers on Vercel. Signed demo sessions enforce Biller and Admin roles. Prisma stores patients, insurance records, claims and source-document metadata in Supabase PostgreSQL. Cloudflare R2 stores private PDFs. PDF.js reads embedded text and Tesseract.js handles scanned pages before the biller reviews every extracted value.</w:t>
       </w:r>
     </w:p>
     <w:tbl>
@@ -2314,17 +2256,7 @@
             <w:shd w:fill="1F4E78"/>
           </w:tcPr>
           <w:p>
-            <w:pPr>
-              <w:spacing w:after="0" w:line="252" w:lineRule="auto"/>
-              <w:jc w:val="center"/>
-            </w:pPr>
-            <w:r>
-              <w:rPr>
-                <w:rFonts w:ascii="Times New Roman" w:hAnsi="Times New Roman"/>
-                <w:b/>
-                <w:color w:val="FFFFFF"/>
-                <w:sz w:val="18"/>
-              </w:rPr>
+            <w:r>
               <w:t>Next.js browser UI</w:t>
             </w:r>
           </w:p>
@@ -2342,17 +2274,7 @@
             <w:shd w:fill="1F4E78"/>
           </w:tcPr>
           <w:p>
-            <w:pPr>
-              <w:spacing w:after="0" w:line="252" w:lineRule="auto"/>
-              <w:jc w:val="center"/>
-            </w:pPr>
-            <w:r>
-              <w:rPr>
-                <w:rFonts w:ascii="Times New Roman" w:hAnsi="Times New Roman"/>
-                <w:b/>
-                <w:color w:val="FFFFFF"/>
-                <w:sz w:val="18"/>
-              </w:rPr>
+            <w:r>
               <w:t>Next.js Node.js API</w:t>
             </w:r>
           </w:p>
@@ -2370,17 +2292,7 @@
             <w:shd w:fill="1F4E78"/>
           </w:tcPr>
           <w:p>
-            <w:pPr>
-              <w:spacing w:after="0" w:line="252" w:lineRule="auto"/>
-              <w:jc w:val="center"/>
-            </w:pPr>
-            <w:r>
-              <w:rPr>
-                <w:rFonts w:ascii="Times New Roman" w:hAnsi="Times New Roman"/>
-                <w:b/>
-                <w:color w:val="FFFFFF"/>
-                <w:sz w:val="18"/>
-              </w:rPr>
+            <w:r>
               <w:t>Persistent services</w:t>
             </w:r>
           </w:p>
@@ -2402,15 +2314,8 @@
             </w:tcMar>
           </w:tcPr>
           <w:p>
-            <w:pPr>
-              <w:spacing w:after="0" w:line="252" w:lineRule="auto"/>
-            </w:pPr>
-            <w:r>
-              <w:rPr>
-                <w:rFonts w:ascii="Times New Roman" w:hAnsi="Times New Roman"/>
-                <w:sz w:val="18"/>
-              </w:rPr>
-              <w:t>Upload, select, run, debug, inspect</w:t>
+            <w:r>
+              <w:t>Sign in, manual/PDF entry, review, validation, history, CMS preview</w:t>
             </w:r>
           </w:p>
         </w:tc>
@@ -2426,15 +2331,8 @@
             </w:tcMar>
           </w:tcPr>
           <w:p>
-            <w:pPr>
-              <w:spacing w:after="0" w:line="252" w:lineRule="auto"/>
-            </w:pPr>
-            <w:r>
-              <w:rPr>
-                <w:rFonts w:ascii="Times New Roman" w:hAnsi="Times New Roman"/>
-                <w:sz w:val="18"/>
-              </w:rPr>
-              <w:t>Text/OCR, checks, AI, routing</w:t>
+            <w:r>
+              <w:t>Signed sessions, extraction, validation, claim persistence, protected technical APIs</w:t>
             </w:r>
           </w:p>
         </w:tc>
@@ -2450,15 +2348,8 @@
             </w:tcMar>
           </w:tcPr>
           <w:p>
-            <w:pPr>
-              <w:spacing w:after="0" w:line="252" w:lineRule="auto"/>
-            </w:pPr>
-            <w:r>
-              <w:rPr>
-                <w:rFonts w:ascii="Times New Roman" w:hAnsi="Times New Roman"/>
-                <w:sz w:val="18"/>
-              </w:rPr>
-              <w:t>Prisma/PostgreSQL metadata; R2 PDFs</w:t>
+            <w:r>
+              <w:t>Prisma/PostgreSQL for records; private R2 for source PDFs</w:t>
             </w:r>
           </w:p>
         </w:tc>
@@ -2470,11 +2361,6 @@
         <w:spacing w:before="140" w:after="60"/>
       </w:pPr>
       <w:r>
-        <w:rPr>
-          <w:rFonts w:ascii="Times New Roman" w:hAnsi="Times New Roman"/>
-          <w:b/>
-          <w:sz w:val="21"/>
-        </w:rPr>
         <w:t>Technology choices</w:t>
       </w:r>
     </w:p>
@@ -2484,11 +2370,7 @@
         <w:spacing w:after="40" w:line="252" w:lineRule="auto"/>
       </w:pPr>
       <w:r>
-        <w:rPr>
-          <w:rFonts w:ascii="Times New Roman" w:hAnsi="Times New Roman"/>
-          <w:sz w:val="20"/>
-        </w:rPr>
-        <w:t>Frontend: Next.js App Router, React and TypeScript with one file-selection area and a prominent run action.</w:t>
+        <w:t>Frontend: Next.js App Router, React and TypeScript with one guided claim workflow and a printable CMS-1500-style preview.</w:t>
       </w:r>
     </w:p>
     <w:p>
@@ -2497,11 +2379,7 @@
         <w:spacing w:after="40" w:line="252" w:lineRule="auto"/>
       </w:pPr>
       <w:r>
-        <w:rPr>
-          <w:rFonts w:ascii="Times New Roman" w:hAnsi="Times New Roman"/>
-          <w:sz w:val="20"/>
-        </w:rPr>
-        <w:t>Backend: Next.js Node.js Route Handlers; embedded-text extraction and bundled Tesseract.js OCR. No separate Python server.</w:t>
+        <w:t>Backend: Next.js Node.js Route Handlers for authentication, claim listing and creation, PDF extraction and the admin technical workspace.</w:t>
       </w:r>
     </w:p>
     <w:p>
@@ -2510,11 +2388,7 @@
         <w:spacing w:after="40" w:line="252" w:lineRule="auto"/>
       </w:pPr>
       <w:r>
-        <w:rPr>
-          <w:rFonts w:ascii="Times New Roman" w:hAnsi="Times New Roman"/>
-          <w:sz w:val="20"/>
-        </w:rPr>
-        <w:t>Database: Supabase PostgreSQL through Prisma ORM and pooled connections. Supabase Auth, Storage and Data API are not used.</w:t>
+        <w:t>Database: Supabase PostgreSQL through Prisma ORM, with Patient, Insurance, Claim and Document entities.</w:t>
       </w:r>
     </w:p>
     <w:p>
@@ -2523,11 +2397,7 @@
         <w:spacing w:after="40" w:line="252" w:lineRule="auto"/>
       </w:pPr>
       <w:r>
-        <w:rPr>
-          <w:rFonts w:ascii="Times New Roman" w:hAnsi="Times New Roman"/>
-          <w:sz w:val="20"/>
-        </w:rPr>
-        <w:t>Files and AI: private Cloudflare R2 input/output/backups; Gemini primary and Ollama Cloud fallback, receiving text only.</w:t>
+        <w:t>Files and extraction: private Cloudflare R2 storage; PDF.js embedded-text extraction and bundled Tesseract.js OCR. Extracted values always require human review.</w:t>
       </w:r>
     </w:p>
     <w:p>
@@ -2536,11 +2406,7 @@
         <w:spacing w:after="40" w:line="252" w:lineRule="auto"/>
       </w:pPr>
       <w:r>
-        <w:rPr>
-          <w:rFonts w:ascii="Times New Roman" w:hAnsi="Times New Roman"/>
-          <w:sz w:val="20"/>
-        </w:rPr>
-        <w:t>Deployment and checks: Vercel Hobby, lint/build, API smoke checks and browser-driven production verification.</w:t>
+        <w:t>Deployment and checks: Vercel production, Prisma migrations, lint, TypeScript build and Playwright browser tests against local and production URLs.</w:t>
       </w:r>
     </w:p>
     <w:p>
@@ -2566,12 +2432,7 @@
         <w:spacing w:before="140" w:after="60"/>
       </w:pPr>
       <w:r>
-        <w:rPr>
-          <w:rFonts w:ascii="Times New Roman" w:hAnsi="Times New Roman"/>
-          <w:b/>
-          <w:sz w:val="21"/>
-        </w:rPr>
-        <w:t>Core epics</w:t>
+        <w:t>Core D1 capabilities</w:t>
       </w:r>
     </w:p>
     <w:p>
@@ -2580,11 +2441,7 @@
         <w:spacing w:after="40" w:line="252" w:lineRule="auto"/>
       </w:pPr>
       <w:r>
-        <w:rPr>
-          <w:rFonts w:ascii="Times New Roman" w:hAnsi="Times New Roman"/>
-          <w:sz w:val="20"/>
-        </w:rPr>
-        <w:t>PDF intake and selection of previously uploaded files</w:t>
+        <w:t>Biller and Admin demo sign-in with an eight-hour signed session</w:t>
       </w:r>
     </w:p>
     <w:p>
@@ -2593,11 +2450,7 @@
         <w:spacing w:after="40" w:line="252" w:lineRule="auto"/>
       </w:pPr>
       <w:r>
-        <w:rPr>
-          <w:rFonts w:ascii="Times New Roman" w:hAnsi="Times New Roman"/>
-          <w:sz w:val="20"/>
-        </w:rPr>
-        <w:t>Text extraction and local OCR</w:t>
+        <w:t>Manual patient, insurance and single-service claim entry</w:t>
       </w:r>
     </w:p>
     <w:p>
@@ -2606,11 +2459,7 @@
         <w:spacing w:after="40" w:line="252" w:lineRule="auto"/>
       </w:pPr>
       <w:r>
-        <w:rPr>
-          <w:rFonts w:ascii="Times New Roman" w:hAnsi="Times New Roman"/>
-          <w:sz w:val="20"/>
-        </w:rPr>
-        <w:t>Explainable claim field checks and document routing</w:t>
+        <w:t>PDF upload with embedded-text extraction or local OCR</w:t>
       </w:r>
     </w:p>
     <w:p>
@@ -2619,11 +2468,7 @@
         <w:spacing w:after="40" w:line="252" w:lineRule="auto"/>
       </w:pPr>
       <w:r>
-        <w:rPr>
-          <w:rFonts w:ascii="Times New Roman" w:hAnsi="Times New Roman"/>
-          <w:sz w:val="20"/>
-        </w:rPr>
-        <w:t>Text-only AI extraction with provider fallback</w:t>
+        <w:t>Human review and correction before validation</w:t>
       </w:r>
     </w:p>
     <w:p>
@@ -2632,11 +2477,7 @@
         <w:spacing w:after="40" w:line="252" w:lineRule="auto"/>
       </w:pPr>
       <w:r>
-        <w:rPr>
-          <w:rFonts w:ascii="Times New Roman" w:hAnsi="Times New Roman"/>
-          <w:sz w:val="20"/>
-        </w:rPr>
-        <w:t>Complete runs and inspectable debug checkpoints</w:t>
+        <w:t>Explainable required-field, code-format, date and amount checks</w:t>
       </w:r>
     </w:p>
     <w:p>
@@ -2645,11 +2486,7 @@
         <w:spacing w:after="40" w:line="252" w:lineRule="auto"/>
       </w:pPr>
       <w:r>
-        <w:rPr>
-          <w:rFonts w:ascii="Times New Roman" w:hAnsi="Times New Roman"/>
-          <w:sz w:val="20"/>
-        </w:rPr>
-        <w:t>Original PDF and Markdown report downloads</w:t>
+        <w:t>PostgreSQL claim persistence and recent-claim history</w:t>
       </w:r>
     </w:p>
     <w:p>
@@ -2658,11 +2495,7 @@
         <w:spacing w:after="40" w:line="252" w:lineRule="auto"/>
       </w:pPr>
       <w:r>
-        <w:rPr>
-          <w:rFonts w:ascii="Times New Roman" w:hAnsi="Times New Roman"/>
-          <w:sz w:val="20"/>
-        </w:rPr>
-        <w:t>R2 backup and reset with restoration to input</w:t>
+        <w:t>CMS-1500-style preview with browser print or Save as PDF</w:t>
       </w:r>
     </w:p>
     <w:p>
@@ -2671,11 +2504,6 @@
         <w:spacing w:before="140" w:after="60"/>
       </w:pPr>
       <w:r>
-        <w:rPr>
-          <w:rFonts w:ascii="Times New Roman" w:hAnsi="Times New Roman"/>
-          <w:b/>
-          <w:sz w:val="21"/>
-        </w:rPr>
         <w:t>D1 implementation boundary</w:t>
       </w:r>
     </w:p>
@@ -2717,17 +2545,7 @@
             <w:shd w:fill="1F4E78"/>
           </w:tcPr>
           <w:p>
-            <w:pPr>
-              <w:spacing w:after="0" w:line="252" w:lineRule="auto"/>
-              <w:jc w:val="center"/>
-            </w:pPr>
-            <w:r>
-              <w:rPr>
-                <w:rFonts w:ascii="Times New Roman" w:hAnsi="Times New Roman"/>
-                <w:b/>
-                <w:color w:val="FFFFFF"/>
-                <w:sz w:val="18"/>
-              </w:rPr>
+            <w:r>
               <w:t>Implemented</w:t>
             </w:r>
           </w:p>
@@ -2745,17 +2563,7 @@
             <w:shd w:fill="1F4E78"/>
           </w:tcPr>
           <w:p>
-            <w:pPr>
-              <w:spacing w:after="0" w:line="252" w:lineRule="auto"/>
-              <w:jc w:val="center"/>
-            </w:pPr>
-            <w:r>
-              <w:rPr>
-                <w:rFonts w:ascii="Times New Roman" w:hAnsi="Times New Roman"/>
-                <w:b/>
-                <w:color w:val="FFFFFF"/>
-                <w:sz w:val="18"/>
-              </w:rPr>
+            <w:r>
               <w:t>Partial or limited</w:t>
             </w:r>
           </w:p>
@@ -2773,17 +2581,7 @@
             <w:shd w:fill="1F4E78"/>
           </w:tcPr>
           <w:p>
-            <w:pPr>
-              <w:spacing w:after="0" w:line="252" w:lineRule="auto"/>
-              <w:jc w:val="center"/>
-            </w:pPr>
-            <w:r>
-              <w:rPr>
-                <w:rFonts w:ascii="Times New Roman" w:hAnsi="Times New Roman"/>
-                <w:b/>
-                <w:color w:val="FFFFFF"/>
-                <w:sz w:val="18"/>
-              </w:rPr>
+            <w:r>
               <w:t>Remaining proposal work</w:t>
             </w:r>
           </w:p>
@@ -2805,15 +2603,8 @@
             </w:tcMar>
           </w:tcPr>
           <w:p>
-            <w:pPr>
-              <w:spacing w:after="0" w:line="252" w:lineRule="auto"/>
-            </w:pPr>
-            <w:r>
-              <w:rPr>
-                <w:rFonts w:ascii="Times New Roman" w:hAnsi="Times New Roman"/>
-                <w:sz w:val="18"/>
-              </w:rPr>
-              <w:t>PDF upload and old-file selection</w:t>
+            <w:r>
+              <w:t>Biller and Admin demo roles</w:t>
             </w:r>
           </w:p>
         </w:tc>
@@ -2829,15 +2620,8 @@
             </w:tcMar>
           </w:tcPr>
           <w:p>
-            <w:pPr>
-              <w:spacing w:after="0" w:line="252" w:lineRule="auto"/>
-            </w:pPr>
-            <w:r>
-              <w:rPr>
-                <w:rFonts w:ascii="Times New Roman" w:hAnsi="Times New Roman"/>
-                <w:sz w:val="18"/>
-              </w:rPr>
-              <w:t>4 MB and 50-page limits</w:t>
+            <w:r>
+              <w:t>Demo accounts, not production identity management</w:t>
             </w:r>
           </w:p>
         </w:tc>
@@ -2853,15 +2637,8 @@
             </w:tcMar>
           </w:tcPr>
           <w:p>
-            <w:pPr>
-              <w:spacing w:after="0" w:line="252" w:lineRule="auto"/>
-            </w:pPr>
-            <w:r>
-              <w:rPr>
-                <w:rFonts w:ascii="Times New Roman" w:hAnsi="Times New Roman"/>
-                <w:sz w:val="18"/>
-              </w:rPr>
-              <w:t>Patient/insurance CRUD and roles</w:t>
+            <w:r>
+              <w:t>Organization users, password recovery and audit administration</w:t>
             </w:r>
           </w:p>
         </w:tc>
@@ -2883,15 +2660,8 @@
             <w:shd w:fill="EEF4F8"/>
           </w:tcPr>
           <w:p>
-            <w:pPr>
-              <w:spacing w:after="0" w:line="252" w:lineRule="auto"/>
-            </w:pPr>
-            <w:r>
-              <w:rPr>
-                <w:rFonts w:ascii="Times New Roman" w:hAnsi="Times New Roman"/>
-                <w:sz w:val="18"/>
-              </w:rPr>
-              <w:t>Embedded extraction and Node OCR</w:t>
+            <w:r>
+              <w:t>Manual patient and insurance entry</w:t>
             </w:r>
           </w:p>
         </w:tc>
@@ -2908,15 +2678,8 @@
             <w:shd w:fill="EEF4F8"/>
           </w:tcPr>
           <w:p>
-            <w:pPr>
-              <w:spacing w:after="0" w:line="252" w:lineRule="auto"/>
-            </w:pPr>
-            <w:r>
-              <w:rPr>
-                <w:rFonts w:ascii="Times New Roman" w:hAnsi="Times New Roman"/>
-                <w:sz w:val="18"/>
-              </w:rPr>
-              <w:t>OCR can misread fields</w:t>
+            <w:r>
+              <w:t>Creates a new patient and policy per claim</w:t>
             </w:r>
           </w:p>
         </w:tc>
@@ -2933,15 +2696,8 @@
             <w:shd w:fill="EEF4F8"/>
           </w:tcPr>
           <w:p>
-            <w:pPr>
-              <w:spacing w:after="0" w:line="252" w:lineRule="auto"/>
-            </w:pPr>
-            <w:r>
-              <w:rPr>
-                <w:rFonts w:ascii="Times New Roman" w:hAnsi="Times New Roman"/>
-                <w:sz w:val="18"/>
-              </w:rPr>
-              <w:t>Measured dataset evaluation</w:t>
+            <w:r>
+              <w:t>Full patient search, edit, deduplication and eligibility</w:t>
             </w:r>
           </w:p>
         </w:tc>
@@ -2962,15 +2718,8 @@
             </w:tcMar>
           </w:tcPr>
           <w:p>
-            <w:pPr>
-              <w:spacing w:after="0" w:line="252" w:lineRule="auto"/>
-            </w:pPr>
-            <w:r>
-              <w:rPr>
-                <w:rFonts w:ascii="Times New Roman" w:hAnsi="Times New Roman"/>
-                <w:sz w:val="18"/>
-              </w:rPr>
-              <w:t>Field checks and four output folders</w:t>
+            <w:r>
+              <w:t>PDF extraction and human review</w:t>
             </w:r>
           </w:p>
         </w:tc>
@@ -2986,15 +2735,8 @@
             </w:tcMar>
           </w:tcPr>
           <w:p>
-            <w:pPr>
-              <w:spacing w:after="0" w:line="252" w:lineRule="auto"/>
-            </w:pPr>
-            <w:r>
-              <w:rPr>
-                <w:rFonts w:ascii="Times New Roman" w:hAnsi="Times New Roman"/>
-                <w:sz w:val="18"/>
-              </w:rPr>
-              <w:t>Syntax and presence only</w:t>
+            <w:r>
+              <w:t>Label-based extraction; OCR can misread fields</w:t>
             </w:r>
           </w:p>
         </w:tc>
@@ -3010,15 +2752,8 @@
             </w:tcMar>
           </w:tcPr>
           <w:p>
-            <w:pPr>
-              <w:spacing w:after="0" w:line="252" w:lineRule="auto"/>
-            </w:pPr>
-            <w:r>
-              <w:rPr>
-                <w:rFonts w:ascii="Times New Roman" w:hAnsi="Times New Roman"/>
-                <w:sz w:val="18"/>
-              </w:rPr>
-              <w:t>Insurer eligibility and code lookup</w:t>
+            <w:r>
+              <w:t>Broader document formats and measured extraction accuracy</w:t>
             </w:r>
           </w:p>
         </w:tc>
@@ -3040,15 +2775,8 @@
             <w:shd w:fill="EEF4F8"/>
           </w:tcPr>
           <w:p>
-            <w:pPr>
-              <w:spacing w:after="0" w:line="252" w:lineRule="auto"/>
-            </w:pPr>
-            <w:r>
-              <w:rPr>
-                <w:rFonts w:ascii="Times New Roman" w:hAnsi="Times New Roman"/>
-                <w:sz w:val="18"/>
-              </w:rPr>
-              <w:t>Gemini text extraction; Ollama fallback</w:t>
+            <w:r>
+              <w:t>Claim validation and persistence</w:t>
             </w:r>
           </w:p>
         </w:tc>
@@ -3065,15 +2793,8 @@
             <w:shd w:fill="EEF4F8"/>
           </w:tcPr>
           <w:p>
-            <w:pPr>
-              <w:spacing w:after="0" w:line="252" w:lineRule="auto"/>
-            </w:pPr>
-            <w:r>
-              <w:rPr>
-                <w:rFonts w:ascii="Times New Roman" w:hAnsi="Times New Roman"/>
-                <w:sz w:val="18"/>
-              </w:rPr>
-              <w:t>Quota-dependent; local fallback is labelled</w:t>
+            <w:r>
+              <w:t>Presence and format checks only</w:t>
             </w:r>
           </w:p>
         </w:tc>
@@ -3090,15 +2811,8 @@
             <w:shd w:fill="EEF4F8"/>
           </w:tcPr>
           <w:p>
-            <w:pPr>
-              <w:spacing w:after="0" w:line="252" w:lineRule="auto"/>
-            </w:pPr>
-            <w:r>
-              <w:rPr>
-                <w:rFonts w:ascii="Times New Roman" w:hAnsi="Times New Roman"/>
-                <w:sz w:val="18"/>
-              </w:rPr>
-              <w:t>Trained denial-risk model</w:t>
+            <w:r>
+              <w:t>Official code lookup, payer rules and electronic submission</w:t>
             </w:r>
           </w:p>
         </w:tc>
@@ -3119,15 +2833,8 @@
             </w:tcMar>
           </w:tcPr>
           <w:p>
-            <w:pPr>
-              <w:spacing w:after="0" w:line="252" w:lineRule="auto"/>
-            </w:pPr>
-            <w:r>
-              <w:rPr>
-                <w:rFonts w:ascii="Times New Roman" w:hAnsi="Times New Roman"/>
-                <w:sz w:val="18"/>
-              </w:rPr>
-              <w:t>Debug checkpoints and downloads</w:t>
+            <w:r>
+              <w:t>CMS-1500-style printable preview</w:t>
             </w:r>
           </w:p>
         </w:tc>
@@ -3143,15 +2850,8 @@
             </w:tcMar>
           </w:tcPr>
           <w:p>
-            <w:pPr>
-              <w:spacing w:after="0" w:line="252" w:lineRule="auto"/>
-            </w:pPr>
-            <w:r>
-              <w:rPr>
-                <w:rFonts w:ascii="Times New Roman" w:hAnsi="Times New Roman"/>
-                <w:sz w:val="18"/>
-              </w:rPr>
-              <w:t>Public synthetic-data demo</w:t>
+            <w:r>
+              <w:t>Not an official clearinghouse transaction</w:t>
             </w:r>
           </w:p>
         </w:tc>
@@ -3167,15 +2867,8 @@
             </w:tcMar>
           </w:tcPr>
           <w:p>
-            <w:pPr>
-              <w:spacing w:after="0" w:line="252" w:lineRule="auto"/>
-            </w:pPr>
-            <w:r>
-              <w:rPr>
-                <w:rFonts w:ascii="Times New Roman" w:hAnsi="Times New Roman"/>
-                <w:sz w:val="18"/>
-              </w:rPr>
-              <w:t>CMS-1500 claim generation</w:t>
+            <w:r>
+              <w:t>Certified export/submission and acknowledgement handling</w:t>
             </w:r>
           </w:p>
         </w:tc>
@@ -3197,15 +2890,8 @@
             <w:shd w:fill="EEF4F8"/>
           </w:tcPr>
           <w:p>
-            <w:pPr>
-              <w:spacing w:after="0" w:line="252" w:lineRule="auto"/>
-            </w:pPr>
-            <w:r>
-              <w:rPr>
-                <w:rFonts w:ascii="Times New Roman" w:hAnsi="Times New Roman"/>
-                <w:sz w:val="18"/>
-              </w:rPr>
-              <w:t>Backup/reset and Vercel deployment</w:t>
+            <w:r>
+              <w:t>Recent claims and technical evidence</w:t>
             </w:r>
           </w:p>
         </w:tc>
@@ -3222,15 +2908,8 @@
             <w:shd w:fill="EEF4F8"/>
           </w:tcPr>
           <w:p>
-            <w:pPr>
-              <w:spacing w:after="0" w:line="252" w:lineRule="auto"/>
-            </w:pPr>
-            <w:r>
-              <w:rPr>
-                <w:rFonts w:ascii="Times New Roman" w:hAnsi="Times New Roman"/>
-                <w:sz w:val="18"/>
-              </w:rPr>
-              <w:t>Hosted CI and Git integration not enabled</w:t>
+            <w:r>
+              <w:t>No payment or denial lifecycle</w:t>
             </w:r>
           </w:p>
         </w:tc>
@@ -3247,15 +2926,8 @@
             <w:shd w:fill="EEF4F8"/>
           </w:tcPr>
           <w:p>
-            <w:pPr>
-              <w:spacing w:after="0" w:line="252" w:lineRule="auto"/>
-            </w:pPr>
-            <w:r>
-              <w:rPr>
-                <w:rFonts w:ascii="Times New Roman" w:hAnsi="Times New Roman"/>
-                <w:sz w:val="18"/>
-              </w:rPr>
-              <w:t>Payments, denials and financial reports</w:t>
+            <w:r>
+              <w:t>Payments, denials, financial reports and measured ML</w:t>
             </w:r>
           </w:p>
         </w:tc>
@@ -3266,11 +2938,7 @@
         <w:spacing w:after="100" w:line="269" w:lineRule="auto"/>
       </w:pPr>
       <w:r>
-        <w:rPr>
-          <w:rFonts w:ascii="Times New Roman" w:hAnsi="Times New Roman"/>
-          <w:sz w:val="21"/>
-        </w:rPr>
-        <w:t>The original proposal also includes patient records, charge entry, CMS-1500 generation, payments, denials, financial reports and accountable roles. Those modules are not implemented in this version. We request supervisor confirmation of this narrower D1 increment and the revised Next.js/PostgreSQL stack.</w:t>
+        <w:t>This increment does not submit claims to payers, verify eligibility, post payments, manage denials, reconcile finances or claim that a trained denial-risk model exists. The older AI document router remains available only to the Admin as technical evidence and is not the supervisor-facing D1 product flow.</w:t>
       </w:r>
     </w:p>
     <w:p>
@@ -3295,11 +2963,7 @@
         <w:spacing w:after="100" w:line="269" w:lineRule="auto"/>
       </w:pPr>
       <w:r>
-        <w:rPr>
-          <w:rFonts w:ascii="Times New Roman" w:hAnsi="Times New Roman"/>
-          <w:sz w:val="21"/>
-        </w:rPr>
-        <w:t>Must stories below define the demonstrated PDF increment. Broader billing and security stories remain in the backlog; Done refers only to the stated acceptance check.</w:t>
+        <w:t>The Must stories below define the demonstrated claim-intake increment. Done refers only to the stated acceptance check. Later billing, integration and measured machine-learning work remains in the backlog.</w:t>
       </w:r>
     </w:p>
     <w:tbl>
@@ -3342,15 +3006,11 @@
           </w:tcPr>
           <w:p>
             <w:pPr>
-              <w:spacing w:after="0" w:line="252" w:lineRule="auto"/>
-              <w:jc w:val="center"/>
+              <w:spacing w:after="0"/>
             </w:pPr>
             <w:r>
               <w:rPr>
-                <w:rFonts w:ascii="Times New Roman" w:hAnsi="Times New Roman"/>
-                <w:b/>
-                <w:color w:val="FFFFFF"/>
-                <w:sz w:val="18"/>
+                <w:sz w:val="15"/>
               </w:rPr>
               <w:t>ID</w:t>
             </w:r>
@@ -3370,15 +3030,11 @@
           </w:tcPr>
           <w:p>
             <w:pPr>
-              <w:spacing w:after="0" w:line="252" w:lineRule="auto"/>
-              <w:jc w:val="center"/>
+              <w:spacing w:after="0"/>
             </w:pPr>
             <w:r>
               <w:rPr>
-                <w:rFonts w:ascii="Times New Roman" w:hAnsi="Times New Roman"/>
-                <w:b/>
-                <w:color w:val="FFFFFF"/>
-                <w:sz w:val="18"/>
+                <w:sz w:val="15"/>
               </w:rPr>
               <w:t>Priority</w:t>
             </w:r>
@@ -3398,15 +3054,11 @@
           </w:tcPr>
           <w:p>
             <w:pPr>
-              <w:spacing w:after="0" w:line="252" w:lineRule="auto"/>
-              <w:jc w:val="center"/>
+              <w:spacing w:after="0"/>
             </w:pPr>
             <w:r>
               <w:rPr>
-                <w:rFonts w:ascii="Times New Roman" w:hAnsi="Times New Roman"/>
-                <w:b/>
-                <w:color w:val="FFFFFF"/>
-                <w:sz w:val="18"/>
+                <w:sz w:val="15"/>
               </w:rPr>
               <w:t>User story and acceptance check</w:t>
             </w:r>
@@ -3426,15 +3078,11 @@
           </w:tcPr>
           <w:p>
             <w:pPr>
-              <w:spacing w:after="0" w:line="252" w:lineRule="auto"/>
-              <w:jc w:val="center"/>
+              <w:spacing w:after="0"/>
             </w:pPr>
             <w:r>
               <w:rPr>
-                <w:rFonts w:ascii="Times New Roman" w:hAnsi="Times New Roman"/>
-                <w:b/>
-                <w:color w:val="FFFFFF"/>
-                <w:sz w:val="18"/>
+                <w:sz w:val="15"/>
               </w:rPr>
               <w:t>D1 status</w:t>
             </w:r>
@@ -3458,14 +3106,13 @@
           </w:tcPr>
           <w:p>
             <w:pPr>
-              <w:spacing w:after="0" w:line="252" w:lineRule="auto"/>
+              <w:spacing w:after="0"/>
             </w:pPr>
             <w:r>
               <w:rPr>
-                <w:rFonts w:ascii="Times New Roman" w:hAnsi="Times New Roman"/>
-                <w:sz w:val="18"/>
+                <w:sz w:val="15"/>
               </w:rPr>
-              <w:t>DOC-01</w:t>
+              <w:t>AUTH-01</w:t>
             </w:r>
           </w:p>
         </w:tc>
@@ -3482,12 +3129,11 @@
           </w:tcPr>
           <w:p>
             <w:pPr>
-              <w:spacing w:after="0" w:line="252" w:lineRule="auto"/>
+              <w:spacing w:after="0"/>
             </w:pPr>
             <w:r>
               <w:rPr>
-                <w:rFonts w:ascii="Times New Roman" w:hAnsi="Times New Roman"/>
-                <w:sz w:val="18"/>
+                <w:sz w:val="15"/>
               </w:rPr>
               <w:t>Must</w:t>
             </w:r>
@@ -3506,14 +3152,13 @@
           </w:tcPr>
           <w:p>
             <w:pPr>
-              <w:spacing w:after="0" w:line="252" w:lineRule="auto"/>
+              <w:spacing w:after="0"/>
             </w:pPr>
             <w:r>
               <w:rPr>
-                <w:rFonts w:ascii="Times New Roman" w:hAnsi="Times New Roman"/>
-                <w:sz w:val="18"/>
+                <w:sz w:val="15"/>
               </w:rPr>
-              <w:t>As a reviewer, I upload a valid PDF and find it in input; invalid content is refused.</w:t>
+              <w:t>As a biller or admin, I sign in and protected pages/APIs refuse unauthenticated access.</w:t>
             </w:r>
           </w:p>
         </w:tc>
@@ -3530,12 +3175,11 @@
           </w:tcPr>
           <w:p>
             <w:pPr>
-              <w:spacing w:after="0" w:line="252" w:lineRule="auto"/>
+              <w:spacing w:after="0"/>
             </w:pPr>
             <w:r>
               <w:rPr>
-                <w:rFonts w:ascii="Times New Roman" w:hAnsi="Times New Roman"/>
-                <w:sz w:val="18"/>
+                <w:sz w:val="15"/>
               </w:rPr>
               <w:t>Done</w:t>
             </w:r>
@@ -3560,14 +3204,13 @@
           </w:tcPr>
           <w:p>
             <w:pPr>
-              <w:spacing w:after="0" w:line="252" w:lineRule="auto"/>
+              <w:spacing w:after="0"/>
             </w:pPr>
             <w:r>
               <w:rPr>
-                <w:rFonts w:ascii="Times New Roman" w:hAnsi="Times New Roman"/>
-                <w:sz w:val="18"/>
+                <w:sz w:val="15"/>
               </w:rPr>
-              <w:t>DOC-02</w:t>
+              <w:t>PAT-01</w:t>
             </w:r>
           </w:p>
         </w:tc>
@@ -3585,12 +3228,11 @@
           </w:tcPr>
           <w:p>
             <w:pPr>
-              <w:spacing w:after="0" w:line="252" w:lineRule="auto"/>
+              <w:spacing w:after="0"/>
             </w:pPr>
             <w:r>
               <w:rPr>
-                <w:rFonts w:ascii="Times New Roman" w:hAnsi="Times New Roman"/>
-                <w:sz w:val="18"/>
+                <w:sz w:val="15"/>
               </w:rPr>
               <w:t>Must</w:t>
             </w:r>
@@ -3610,14 +3252,13 @@
           </w:tcPr>
           <w:p>
             <w:pPr>
-              <w:spacing w:after="0" w:line="252" w:lineRule="auto"/>
+              <w:spacing w:after="0"/>
             </w:pPr>
             <w:r>
               <w:rPr>
-                <w:rFonts w:ascii="Times New Roman" w:hAnsi="Times New Roman"/>
-                <w:sz w:val="18"/>
+                <w:sz w:val="15"/>
               </w:rPr>
-              <w:t>As a reviewer, I select any input batch; unselected files remain unchanged.</w:t>
+              <w:t>As a biller, I enter the minimum patient and insurance fields needed for a draft claim.</w:t>
             </w:r>
           </w:p>
         </w:tc>
@@ -3635,12 +3276,11 @@
           </w:tcPr>
           <w:p>
             <w:pPr>
-              <w:spacing w:after="0" w:line="252" w:lineRule="auto"/>
+              <w:spacing w:after="0"/>
             </w:pPr>
             <w:r>
               <w:rPr>
-                <w:rFonts w:ascii="Times New Roman" w:hAnsi="Times New Roman"/>
-                <w:sz w:val="18"/>
+                <w:sz w:val="15"/>
               </w:rPr>
               <w:t>Done</w:t>
             </w:r>
@@ -3664,14 +3304,13 @@
           </w:tcPr>
           <w:p>
             <w:pPr>
-              <w:spacing w:after="0" w:line="252" w:lineRule="auto"/>
+              <w:spacing w:after="0"/>
             </w:pPr>
             <w:r>
               <w:rPr>
-                <w:rFonts w:ascii="Times New Roman" w:hAnsi="Times New Roman"/>
-                <w:sz w:val="18"/>
+                <w:sz w:val="15"/>
               </w:rPr>
-              <w:t>TXT-01</w:t>
+              <w:t>CLM-01</w:t>
             </w:r>
           </w:p>
         </w:tc>
@@ -3688,12 +3327,11 @@
           </w:tcPr>
           <w:p>
             <w:pPr>
-              <w:spacing w:after="0" w:line="252" w:lineRule="auto"/>
+              <w:spacing w:after="0"/>
             </w:pPr>
             <w:r>
               <w:rPr>
-                <w:rFonts w:ascii="Times New Roman" w:hAnsi="Times New Roman"/>
-                <w:sz w:val="18"/>
+                <w:sz w:val="15"/>
               </w:rPr>
               <w:t>Must</w:t>
             </w:r>
@@ -3712,14 +3350,13 @@
           </w:tcPr>
           <w:p>
             <w:pPr>
-              <w:spacing w:after="0" w:line="252" w:lineRule="auto"/>
+              <w:spacing w:after="0"/>
             </w:pPr>
             <w:r>
               <w:rPr>
-                <w:rFonts w:ascii="Times New Roman" w:hAnsi="Times New Roman"/>
-                <w:sz w:val="18"/>
+                <w:sz w:val="15"/>
               </w:rPr>
-              <w:t>As a reviewer, I obtain embedded text or OCR text before AI; OCR uses no AI calls.</w:t>
+              <w:t>As a biller, I enter provider, service, diagnosis, procedure and charge information.</w:t>
             </w:r>
           </w:p>
         </w:tc>
@@ -3736,12 +3373,11 @@
           </w:tcPr>
           <w:p>
             <w:pPr>
-              <w:spacing w:after="0" w:line="252" w:lineRule="auto"/>
+              <w:spacing w:after="0"/>
             </w:pPr>
             <w:r>
               <w:rPr>
-                <w:rFonts w:ascii="Times New Roman" w:hAnsi="Times New Roman"/>
-                <w:sz w:val="18"/>
+                <w:sz w:val="15"/>
               </w:rPr>
               <w:t>Done</w:t>
             </w:r>
@@ -3766,14 +3402,13 @@
           </w:tcPr>
           <w:p>
             <w:pPr>
-              <w:spacing w:after="0" w:line="252" w:lineRule="auto"/>
+              <w:spacing w:after="0"/>
             </w:pPr>
             <w:r>
               <w:rPr>
-                <w:rFonts w:ascii="Times New Roman" w:hAnsi="Times New Roman"/>
-                <w:sz w:val="18"/>
+                <w:sz w:val="15"/>
               </w:rPr>
-              <w:t>VAL-01</w:t>
+              <w:t>PDF-01</w:t>
             </w:r>
           </w:p>
         </w:tc>
@@ -3791,12 +3426,11 @@
           </w:tcPr>
           <w:p>
             <w:pPr>
-              <w:spacing w:after="0" w:line="252" w:lineRule="auto"/>
+              <w:spacing w:after="0"/>
             </w:pPr>
             <w:r>
               <w:rPr>
-                <w:rFonts w:ascii="Times New Roman" w:hAnsi="Times New Roman"/>
-                <w:sz w:val="18"/>
+                <w:sz w:val="15"/>
               </w:rPr>
               <w:t>Must</w:t>
             </w:r>
@@ -3816,14 +3450,13 @@
           </w:tcPr>
           <w:p>
             <w:pPr>
-              <w:spacing w:after="0" w:line="252" w:lineRule="auto"/>
+              <w:spacing w:after="0"/>
             </w:pPr>
             <w:r>
               <w:rPr>
-                <w:rFonts w:ascii="Times New Roman" w:hAnsi="Times New Roman"/>
-                <w:sz w:val="18"/>
+                <w:sz w:val="15"/>
               </w:rPr>
-              <w:t>As a reviewer, I see checks for member ID, code format, amount, date and provider.</w:t>
+              <w:t>As a biller, I upload a valid PDF and receive editable extracted fields; invalid files are refused.</w:t>
             </w:r>
           </w:p>
         </w:tc>
@@ -3841,12 +3474,11 @@
           </w:tcPr>
           <w:p>
             <w:pPr>
-              <w:spacing w:after="0" w:line="252" w:lineRule="auto"/>
+              <w:spacing w:after="0"/>
             </w:pPr>
             <w:r>
               <w:rPr>
-                <w:rFonts w:ascii="Times New Roman" w:hAnsi="Times New Roman"/>
-                <w:sz w:val="18"/>
+                <w:sz w:val="15"/>
               </w:rPr>
               <w:t>Done</w:t>
             </w:r>
@@ -3870,14 +3502,13 @@
           </w:tcPr>
           <w:p>
             <w:pPr>
-              <w:spacing w:after="0" w:line="252" w:lineRule="auto"/>
+              <w:spacing w:after="0"/>
             </w:pPr>
             <w:r>
               <w:rPr>
-                <w:rFonts w:ascii="Times New Roman" w:hAnsi="Times New Roman"/>
-                <w:sz w:val="18"/>
+                <w:sz w:val="15"/>
               </w:rPr>
-              <w:t>AI-01</w:t>
+              <w:t>REV-01</w:t>
             </w:r>
           </w:p>
         </w:tc>
@@ -3894,12 +3525,11 @@
           </w:tcPr>
           <w:p>
             <w:pPr>
-              <w:spacing w:after="0" w:line="252" w:lineRule="auto"/>
+              <w:spacing w:after="0"/>
             </w:pPr>
             <w:r>
               <w:rPr>
-                <w:rFonts w:ascii="Times New Roman" w:hAnsi="Times New Roman"/>
-                <w:sz w:val="18"/>
+                <w:sz w:val="15"/>
               </w:rPr>
               <w:t>Must</w:t>
             </w:r>
@@ -3918,14 +3548,13 @@
           </w:tcPr>
           <w:p>
             <w:pPr>
-              <w:spacing w:after="0" w:line="252" w:lineRule="auto"/>
+              <w:spacing w:after="0"/>
             </w:pPr>
             <w:r>
               <w:rPr>
-                <w:rFonts w:ascii="Times New Roman" w:hAnsi="Times New Roman"/>
-                <w:sz w:val="18"/>
+                <w:sz w:val="15"/>
               </w:rPr>
-              <w:t>As a reviewer, I inspect text-only extraction and the actual provider used.</w:t>
+              <w:t>As a biller, I review and correct all manual or extracted values before validation.</w:t>
             </w:r>
           </w:p>
         </w:tc>
@@ -3942,12 +3571,11 @@
           </w:tcPr>
           <w:p>
             <w:pPr>
-              <w:spacing w:after="0" w:line="252" w:lineRule="auto"/>
+              <w:spacing w:after="0"/>
             </w:pPr>
             <w:r>
               <w:rPr>
-                <w:rFonts w:ascii="Times New Roman" w:hAnsi="Times New Roman"/>
-                <w:sz w:val="18"/>
+                <w:sz w:val="15"/>
               </w:rPr>
               <w:t>Done</w:t>
             </w:r>
@@ -3972,14 +3600,13 @@
           </w:tcPr>
           <w:p>
             <w:pPr>
-              <w:spacing w:after="0" w:line="252" w:lineRule="auto"/>
+              <w:spacing w:after="0"/>
             </w:pPr>
             <w:r>
               <w:rPr>
-                <w:rFonts w:ascii="Times New Roman" w:hAnsi="Times New Roman"/>
-                <w:sz w:val="18"/>
+                <w:sz w:val="15"/>
               </w:rPr>
-              <w:t>ROUTE-01</w:t>
+              <w:t>VAL-01</w:t>
             </w:r>
           </w:p>
         </w:tc>
@@ -3997,12 +3624,11 @@
           </w:tcPr>
           <w:p>
             <w:pPr>
-              <w:spacing w:after="0" w:line="252" w:lineRule="auto"/>
+              <w:spacing w:after="0"/>
             </w:pPr>
             <w:r>
               <w:rPr>
-                <w:rFonts w:ascii="Times New Roman" w:hAnsi="Times New Roman"/>
-                <w:sz w:val="18"/>
+                <w:sz w:val="15"/>
               </w:rPr>
               <w:t>Must</w:t>
             </w:r>
@@ -4022,14 +3648,13 @@
           </w:tcPr>
           <w:p>
             <w:pPr>
-              <w:spacing w:after="0" w:line="252" w:lineRule="auto"/>
+              <w:spacing w:after="0"/>
             </w:pPr>
             <w:r>
               <w:rPr>
-                <w:rFonts w:ascii="Times New Roman" w:hAnsi="Times New Roman"/>
-                <w:sz w:val="18"/>
+                <w:sz w:val="15"/>
               </w:rPr>
-              <w:t>As a reviewer, I find originals in accepted, review, rejected or failed folders.</w:t>
+              <w:t>As a biller, I see explainable checks and cannot save while required checks fail.</w:t>
             </w:r>
           </w:p>
         </w:tc>
@@ -4047,12 +3672,11 @@
           </w:tcPr>
           <w:p>
             <w:pPr>
-              <w:spacing w:after="0" w:line="252" w:lineRule="auto"/>
+              <w:spacing w:after="0"/>
             </w:pPr>
             <w:r>
               <w:rPr>
-                <w:rFonts w:ascii="Times New Roman" w:hAnsi="Times New Roman"/>
-                <w:sz w:val="18"/>
+                <w:sz w:val="15"/>
               </w:rPr>
               <w:t>Done</w:t>
             </w:r>
@@ -4076,14 +3700,13 @@
           </w:tcPr>
           <w:p>
             <w:pPr>
-              <w:spacing w:after="0" w:line="252" w:lineRule="auto"/>
+              <w:spacing w:after="0"/>
             </w:pPr>
             <w:r>
               <w:rPr>
-                <w:rFonts w:ascii="Times New Roman" w:hAnsi="Times New Roman"/>
-                <w:sz w:val="18"/>
+                <w:sz w:val="15"/>
               </w:rPr>
-              <w:t>DBG-01</w:t>
+              <w:t>DB-01</w:t>
             </w:r>
           </w:p>
         </w:tc>
@@ -4100,14 +3723,13 @@
           </w:tcPr>
           <w:p>
             <w:pPr>
-              <w:spacing w:after="0" w:line="252" w:lineRule="auto"/>
+              <w:spacing w:after="0"/>
             </w:pPr>
             <w:r>
               <w:rPr>
-                <w:rFonts w:ascii="Times New Roman" w:hAnsi="Times New Roman"/>
-                <w:sz w:val="18"/>
+                <w:sz w:val="15"/>
               </w:rPr>
-              <w:t>Should</w:t>
+              <w:t>Must</w:t>
             </w:r>
           </w:p>
         </w:tc>
@@ -4124,14 +3746,13 @@
           </w:tcPr>
           <w:p>
             <w:pPr>
-              <w:spacing w:after="0" w:line="252" w:lineRule="auto"/>
+              <w:spacing w:after="0"/>
             </w:pPr>
             <w:r>
               <w:rPr>
-                <w:rFonts w:ascii="Times New Roman" w:hAnsi="Times New Roman"/>
-                <w:sz w:val="18"/>
+                <w:sz w:val="15"/>
               </w:rPr>
-              <w:t>As a reviewer, I run all five debug stages separately and see returned data.</w:t>
+              <w:t>As a biller, I save a validated draft and find it in recent claim history.</w:t>
             </w:r>
           </w:p>
         </w:tc>
@@ -4148,12 +3769,11 @@
           </w:tcPr>
           <w:p>
             <w:pPr>
-              <w:spacing w:after="0" w:line="252" w:lineRule="auto"/>
+              <w:spacing w:after="0"/>
             </w:pPr>
             <w:r>
               <w:rPr>
-                <w:rFonts w:ascii="Times New Roman" w:hAnsi="Times New Roman"/>
-                <w:sz w:val="18"/>
+                <w:sz w:val="15"/>
               </w:rPr>
               <w:t>Done</w:t>
             </w:r>
@@ -4178,14 +3798,13 @@
           </w:tcPr>
           <w:p>
             <w:pPr>
-              <w:spacing w:after="0" w:line="252" w:lineRule="auto"/>
+              <w:spacing w:after="0"/>
             </w:pPr>
             <w:r>
               <w:rPr>
-                <w:rFonts w:ascii="Times New Roman" w:hAnsi="Times New Roman"/>
-                <w:sz w:val="18"/>
+                <w:sz w:val="15"/>
               </w:rPr>
-              <w:t>OPS-01</w:t>
+              <w:t>CMS-01</w:t>
             </w:r>
           </w:p>
         </w:tc>
@@ -4203,12 +3822,11 @@
           </w:tcPr>
           <w:p>
             <w:pPr>
-              <w:spacing w:after="0" w:line="252" w:lineRule="auto"/>
+              <w:spacing w:after="0"/>
             </w:pPr>
             <w:r>
               <w:rPr>
-                <w:rFonts w:ascii="Times New Roman" w:hAnsi="Times New Roman"/>
-                <w:sz w:val="18"/>
+                <w:sz w:val="15"/>
               </w:rPr>
               <w:t>Must</w:t>
             </w:r>
@@ -4228,14 +3846,13 @@
           </w:tcPr>
           <w:p>
             <w:pPr>
-              <w:spacing w:after="0" w:line="252" w:lineRule="auto"/>
+              <w:spacing w:after="0"/>
             </w:pPr>
             <w:r>
               <w:rPr>
-                <w:rFonts w:ascii="Times New Roman" w:hAnsi="Times New Roman"/>
-                <w:sz w:val="18"/>
+                <w:sz w:val="15"/>
               </w:rPr>
-              <w:t>As a reviewer, I back up/reset; output clears and all PDFs return to input.</w:t>
+              <w:t>As a biller, I open a CMS-1500-style preview and print or save it as PDF.</w:t>
             </w:r>
           </w:p>
         </w:tc>
@@ -4253,12 +3870,11 @@
           </w:tcPr>
           <w:p>
             <w:pPr>
-              <w:spacing w:after="0" w:line="252" w:lineRule="auto"/>
+              <w:spacing w:after="0"/>
             </w:pPr>
             <w:r>
               <w:rPr>
-                <w:rFonts w:ascii="Times New Roman" w:hAnsi="Times New Roman"/>
-                <w:sz w:val="18"/>
+                <w:sz w:val="15"/>
               </w:rPr>
               <w:t>Done</w:t>
             </w:r>
@@ -4282,14 +3898,13 @@
           </w:tcPr>
           <w:p>
             <w:pPr>
-              <w:spacing w:after="0" w:line="252" w:lineRule="auto"/>
+              <w:spacing w:after="0"/>
             </w:pPr>
             <w:r>
               <w:rPr>
-                <w:rFonts w:ascii="Times New Roman" w:hAnsi="Times New Roman"/>
-                <w:sz w:val="18"/>
+                <w:sz w:val="15"/>
               </w:rPr>
-              <w:t>AUTH-01</w:t>
+              <w:t>TECH-01</w:t>
             </w:r>
           </w:p>
         </w:tc>
@@ -4306,14 +3921,13 @@
           </w:tcPr>
           <w:p>
             <w:pPr>
-              <w:spacing w:after="0" w:line="252" w:lineRule="auto"/>
+              <w:spacing w:after="0"/>
             </w:pPr>
             <w:r>
               <w:rPr>
-                <w:rFonts w:ascii="Times New Roman" w:hAnsi="Times New Roman"/>
-                <w:sz w:val="18"/>
+                <w:sz w:val="15"/>
               </w:rPr>
-              <w:t>Must later</w:t>
+              <w:t>Should</w:t>
             </w:r>
           </w:p>
         </w:tc>
@@ -4330,14 +3944,13 @@
           </w:tcPr>
           <w:p>
             <w:pPr>
-              <w:spacing w:after="0" w:line="252" w:lineRule="auto"/>
+              <w:spacing w:after="0"/>
             </w:pPr>
             <w:r>
               <w:rPr>
-                <w:rFonts w:ascii="Times New Roman" w:hAnsi="Times New Roman"/>
-                <w:sz w:val="18"/>
+                <w:sz w:val="15"/>
               </w:rPr>
-              <w:t>As an operational user, I access private records through accountable roles.</w:t>
+              <w:t>As an admin, I can open the older technical PDF workspace without exposing it to billers.</w:t>
             </w:r>
           </w:p>
         </w:tc>
@@ -4354,14 +3967,13 @@
           </w:tcPr>
           <w:p>
             <w:pPr>
-              <w:spacing w:after="0" w:line="252" w:lineRule="auto"/>
+              <w:spacing w:after="0"/>
             </w:pPr>
             <w:r>
               <w:rPr>
-                <w:rFonts w:ascii="Times New Roman" w:hAnsi="Times New Roman"/>
-                <w:sz w:val="18"/>
+                <w:sz w:val="15"/>
               </w:rPr>
-              <w:t>Planned</w:t>
+              <w:t>Done</w:t>
             </w:r>
           </w:p>
         </w:tc>
@@ -4384,14 +3996,13 @@
           </w:tcPr>
           <w:p>
             <w:pPr>
-              <w:spacing w:after="0" w:line="252" w:lineRule="auto"/>
+              <w:spacing w:after="0"/>
             </w:pPr>
             <w:r>
               <w:rPr>
-                <w:rFonts w:ascii="Times New Roman" w:hAnsi="Times New Roman"/>
-                <w:sz w:val="18"/>
+                <w:sz w:val="15"/>
               </w:rPr>
-              <w:t>BILL-01</w:t>
+              <w:t>PAY-01</w:t>
             </w:r>
           </w:p>
         </w:tc>
@@ -4409,14 +4020,13 @@
           </w:tcPr>
           <w:p>
             <w:pPr>
-              <w:spacing w:after="0" w:line="252" w:lineRule="auto"/>
+              <w:spacing w:after="0"/>
             </w:pPr>
             <w:r>
               <w:rPr>
-                <w:rFonts w:ascii="Times New Roman" w:hAnsi="Times New Roman"/>
-                <w:sz w:val="18"/>
+                <w:sz w:val="15"/>
               </w:rPr>
-              <w:t>Must later</w:t>
+              <w:t>Later</w:t>
             </w:r>
           </w:p>
         </w:tc>
@@ -4434,14 +4044,13 @@
           </w:tcPr>
           <w:p>
             <w:pPr>
-              <w:spacing w:after="0" w:line="252" w:lineRule="auto"/>
+              <w:spacing w:after="0"/>
             </w:pPr>
             <w:r>
               <w:rPr>
-                <w:rFonts w:ascii="Times New Roman" w:hAnsi="Times New Roman"/>
-                <w:sz w:val="18"/>
+                <w:sz w:val="15"/>
               </w:rPr>
-              <w:t>As a biller, I manage patients/charges and create CMS-1500 claims.</w:t>
+              <w:t>As a biller, I post payments, adjustments and denial outcomes.</w:t>
             </w:r>
           </w:p>
         </w:tc>
@@ -4459,218 +4068,11 @@
           </w:tcPr>
           <w:p>
             <w:pPr>
-              <w:spacing w:after="0" w:line="252" w:lineRule="auto"/>
+              <w:spacing w:after="0"/>
             </w:pPr>
             <w:r>
               <w:rPr>
-                <w:rFonts w:ascii="Times New Roman" w:hAnsi="Times New Roman"/>
-                <w:sz w:val="18"/>
-              </w:rPr>
-              <w:t>Planned</w:t>
-            </w:r>
-          </w:p>
-        </w:tc>
-      </w:tr>
-      <w:tr>
-        <w:trPr>
-          <w:cantSplit/>
-        </w:trPr>
-        <w:tc>
-          <w:tcPr>
-            <w:tcW w:type="dxa" w:w="1152"/>
-            <w:vAlign w:val="center"/>
-            <w:tcMar>
-              <w:top w:w="90" w:type="dxa"/>
-              <w:start w:w="120" w:type="dxa"/>
-              <w:bottom w:w="90" w:type="dxa"/>
-              <w:end w:w="120" w:type="dxa"/>
-            </w:tcMar>
-          </w:tcPr>
-          <w:p>
-            <w:pPr>
-              <w:spacing w:after="0" w:line="252" w:lineRule="auto"/>
-            </w:pPr>
-            <w:r>
-              <w:rPr>
-                <w:rFonts w:ascii="Times New Roman" w:hAnsi="Times New Roman"/>
-                <w:sz w:val="18"/>
-              </w:rPr>
-              <w:t>FIN-01</w:t>
-            </w:r>
-          </w:p>
-        </w:tc>
-        <w:tc>
-          <w:tcPr>
-            <w:tcW w:type="dxa" w:w="1008"/>
-            <w:vAlign w:val="center"/>
-            <w:tcMar>
-              <w:top w:w="90" w:type="dxa"/>
-              <w:start w:w="120" w:type="dxa"/>
-              <w:bottom w:w="90" w:type="dxa"/>
-              <w:end w:w="120" w:type="dxa"/>
-            </w:tcMar>
-          </w:tcPr>
-          <w:p>
-            <w:pPr>
-              <w:spacing w:after="0" w:line="252" w:lineRule="auto"/>
-            </w:pPr>
-            <w:r>
-              <w:rPr>
-                <w:rFonts w:ascii="Times New Roman" w:hAnsi="Times New Roman"/>
-                <w:sz w:val="18"/>
-              </w:rPr>
-              <w:t>Must later</w:t>
-            </w:r>
-          </w:p>
-        </w:tc>
-        <w:tc>
-          <w:tcPr>
-            <w:tcW w:type="dxa" w:w="5544"/>
-            <w:vAlign w:val="center"/>
-            <w:tcMar>
-              <w:top w:w="90" w:type="dxa"/>
-              <w:start w:w="120" w:type="dxa"/>
-              <w:bottom w:w="90" w:type="dxa"/>
-              <w:end w:w="120" w:type="dxa"/>
-            </w:tcMar>
-          </w:tcPr>
-          <w:p>
-            <w:pPr>
-              <w:spacing w:after="0" w:line="252" w:lineRule="auto"/>
-            </w:pPr>
-            <w:r>
-              <w:rPr>
-                <w:rFonts w:ascii="Times New Roman" w:hAnsi="Times New Roman"/>
-                <w:sz w:val="18"/>
-              </w:rPr>
-              <w:t>As a biller, I post payments/denials and reconcile financial reports.</w:t>
-            </w:r>
-          </w:p>
-        </w:tc>
-        <w:tc>
-          <w:tcPr>
-            <w:tcW w:type="dxa" w:w="1296"/>
-            <w:vAlign w:val="center"/>
-            <w:tcMar>
-              <w:top w:w="90" w:type="dxa"/>
-              <w:start w:w="120" w:type="dxa"/>
-              <w:bottom w:w="90" w:type="dxa"/>
-              <w:end w:w="120" w:type="dxa"/>
-            </w:tcMar>
-          </w:tcPr>
-          <w:p>
-            <w:pPr>
-              <w:spacing w:after="0" w:line="252" w:lineRule="auto"/>
-            </w:pPr>
-            <w:r>
-              <w:rPr>
-                <w:rFonts w:ascii="Times New Roman" w:hAnsi="Times New Roman"/>
-                <w:sz w:val="18"/>
-              </w:rPr>
-              <w:t>Planned</w:t>
-            </w:r>
-          </w:p>
-        </w:tc>
-      </w:tr>
-      <w:tr>
-        <w:trPr>
-          <w:cantSplit/>
-        </w:trPr>
-        <w:tc>
-          <w:tcPr>
-            <w:tcW w:type="dxa" w:w="1152"/>
-            <w:vAlign w:val="center"/>
-            <w:tcMar>
-              <w:top w:w="90" w:type="dxa"/>
-              <w:start w:w="120" w:type="dxa"/>
-              <w:bottom w:w="90" w:type="dxa"/>
-              <w:end w:w="120" w:type="dxa"/>
-            </w:tcMar>
-            <w:shd w:fill="EEF4F8"/>
-          </w:tcPr>
-          <w:p>
-            <w:pPr>
-              <w:spacing w:after="0" w:line="252" w:lineRule="auto"/>
-            </w:pPr>
-            <w:r>
-              <w:rPr>
-                <w:rFonts w:ascii="Times New Roman" w:hAnsi="Times New Roman"/>
-                <w:sz w:val="18"/>
-              </w:rPr>
-              <w:t>ML-01</w:t>
-            </w:r>
-          </w:p>
-        </w:tc>
-        <w:tc>
-          <w:tcPr>
-            <w:tcW w:type="dxa" w:w="1008"/>
-            <w:vAlign w:val="center"/>
-            <w:tcMar>
-              <w:top w:w="90" w:type="dxa"/>
-              <w:start w:w="120" w:type="dxa"/>
-              <w:bottom w:w="90" w:type="dxa"/>
-              <w:end w:w="120" w:type="dxa"/>
-            </w:tcMar>
-            <w:shd w:fill="EEF4F8"/>
-          </w:tcPr>
-          <w:p>
-            <w:pPr>
-              <w:spacing w:after="0" w:line="252" w:lineRule="auto"/>
-            </w:pPr>
-            <w:r>
-              <w:rPr>
-                <w:rFonts w:ascii="Times New Roman" w:hAnsi="Times New Roman"/>
-                <w:sz w:val="18"/>
-              </w:rPr>
-              <w:t>Must later</w:t>
-            </w:r>
-          </w:p>
-        </w:tc>
-        <w:tc>
-          <w:tcPr>
-            <w:tcW w:type="dxa" w:w="5544"/>
-            <w:vAlign w:val="center"/>
-            <w:tcMar>
-              <w:top w:w="90" w:type="dxa"/>
-              <w:start w:w="120" w:type="dxa"/>
-              <w:bottom w:w="90" w:type="dxa"/>
-              <w:end w:w="120" w:type="dxa"/>
-            </w:tcMar>
-            <w:shd w:fill="EEF4F8"/>
-          </w:tcPr>
-          <w:p>
-            <w:pPr>
-              <w:spacing w:after="0" w:line="252" w:lineRule="auto"/>
-            </w:pPr>
-            <w:r>
-              <w:rPr>
-                <w:rFonts w:ascii="Times New Roman" w:hAnsi="Times New Roman"/>
-                <w:sz w:val="18"/>
-              </w:rPr>
-              <w:t>As the team, we evaluate a denial-risk model against a baseline on held-out data.</w:t>
-            </w:r>
-          </w:p>
-        </w:tc>
-        <w:tc>
-          <w:tcPr>
-            <w:tcW w:type="dxa" w:w="1296"/>
-            <w:vAlign w:val="center"/>
-            <w:tcMar>
-              <w:top w:w="90" w:type="dxa"/>
-              <w:start w:w="120" w:type="dxa"/>
-              <w:bottom w:w="90" w:type="dxa"/>
-              <w:end w:w="120" w:type="dxa"/>
-            </w:tcMar>
-            <w:shd w:fill="EEF4F8"/>
-          </w:tcPr>
-          <w:p>
-            <w:pPr>
-              <w:spacing w:after="0" w:line="252" w:lineRule="auto"/>
-            </w:pPr>
-            <w:r>
-              <w:rPr>
-                <w:rFonts w:ascii="Times New Roman" w:hAnsi="Times New Roman"/>
-                <w:sz w:val="18"/>
+                <w:sz w:val="15"/>
               </w:rPr>
               <w:t>Planned</w:t>
             </w:r>
@@ -4700,11 +4102,7 @@
         <w:spacing w:after="100" w:line="269" w:lineRule="auto"/>
       </w:pPr>
       <w:r>
-        <w:rPr>
-          <w:rFonts w:ascii="Times New Roman" w:hAnsi="Times New Roman"/>
-          <w:sz w:val="21"/>
-        </w:rPr>
-        <w:t>Open https://medbill-steel.vercel.app without login. Select one or more existing input PDFs, then choose Complete flow or Debug step-by-step. Show extraction, checks, AI output and the final folder. Inspect a result and download its original PDF/report. Demonstrate backup/reset only after explaining that it restores every PDF to input and clears output.</w:t>
+        <w:t>Open https://medbill-steel.vercel.app and sign in with the Biller demo account. First show manual entry: use synthetic patient and insurance data, enter one service line, review it, validate it and open the CMS-1500-style preview. Then upload the supplied synthetic claim PDF, confirm that the same editable form is populated, correct any extraction error and complete the same validation and preview path. Use the Admin role only if the supervisor asks to see the preserved technical workspace.</w:t>
       </w:r>
     </w:p>
     <w:p>
@@ -4715,8 +4113,8 @@
       <w:r>
         <w:drawing>
           <wp:inline xmlns:a="http://schemas.openxmlformats.org/drawingml/2006/main" xmlns:pic="http://schemas.openxmlformats.org/drawingml/2006/picture">
-            <wp:extent cx="5486400" cy="2228850"/>
-            <wp:docPr id="1" name="Picture 1" descr="Architecture for the current Next.js MedBill D1 version"/>
+            <wp:extent cx="5806440" cy="4419346"/>
+            <wp:docPr id="4" name="Picture 4"/>
             <wp:cNvGraphicFramePr>
               <a:graphicFrameLocks noChangeAspect="1"/>
             </wp:cNvGraphicFramePr>
@@ -4724,11 +4122,11 @@
               <a:graphicData uri="http://schemas.openxmlformats.org/drawingml/2006/picture">
                 <pic:pic>
                   <pic:nvPicPr>
-                    <pic:cNvPr id="0" name="01-login.png"/>
+                    <pic:cNvPr id="0" name="D1_Claim_Workspace.png"/>
                     <pic:cNvPicPr/>
                   </pic:nvPicPr>
                   <pic:blipFill>
-                    <a:blip r:embed="rId14"/>
+                    <a:blip r:embed="rId17"/>
                     <a:stretch>
                       <a:fillRect/>
                     </a:stretch>
@@ -4736,7 +4134,7 @@
                   <pic:spPr>
                     <a:xfrm>
                       <a:off x="0" y="0"/>
-                      <a:ext cx="5486400" cy="2228850"/>
+                      <a:ext cx="5806440" cy="4419346"/>
                     </a:xfrm>
                     <a:prstGeom prst="rect"/>
                   </pic:spPr>
@@ -4753,133 +4151,15 @@
         <w:jc w:val="center"/>
       </w:pPr>
       <w:r>
-        <w:rPr>
-          <w:rFonts w:ascii="Times New Roman" w:hAnsi="Times New Roman"/>
-          <w:i/>
-          <w:sz w:val="18"/>
-        </w:rPr>
-        <w:t>Figure 1  Current Next.js processing architecture</w:t>
+        <w:t>Figure 1  Deployed D1 claim workspace after production verification</w:t>
       </w:r>
     </w:p>
     <w:p>
       <w:pPr>
-        <w:pageBreakBefore w:val="0"/>
-        <w:jc w:val="center"/>
-      </w:pPr>
-      <w:r>
-        <w:drawing>
-          <wp:inline xmlns:a="http://schemas.openxmlformats.org/drawingml/2006/main" xmlns:pic="http://schemas.openxmlformats.org/drawingml/2006/picture">
-            <wp:extent cx="5486400" cy="2228850"/>
-            <wp:docPr id="2" name="Picture 2" descr="Data Model for the current Next.js MedBill D1 version"/>
-            <wp:cNvGraphicFramePr>
-              <a:graphicFrameLocks noChangeAspect="1"/>
-            </wp:cNvGraphicFramePr>
-            <a:graphic>
-              <a:graphicData uri="http://schemas.openxmlformats.org/drawingml/2006/picture">
-                <pic:pic>
-                  <pic:nvPicPr>
-                    <pic:cNvPr id="0" name="02-dashboard.png"/>
-                    <pic:cNvPicPr/>
-                  </pic:nvPicPr>
-                  <pic:blipFill>
-                    <a:blip r:embed="rId15"/>
-                    <a:stretch>
-                      <a:fillRect/>
-                    </a:stretch>
-                  </pic:blipFill>
-                  <pic:spPr>
-                    <a:xfrm>
-                      <a:off x="0" y="0"/>
-                      <a:ext cx="5486400" cy="2228850"/>
-                    </a:xfrm>
-                    <a:prstGeom prst="rect"/>
-                  </pic:spPr>
-                </pic:pic>
-              </a:graphicData>
-            </a:graphic>
-          </wp:inline>
-        </w:drawing>
-      </w:r>
-    </w:p>
-    <w:p>
-      <w:pPr>
-        <w:spacing w:before="40" w:after="160"/>
-        <w:jc w:val="center"/>
-      </w:pPr>
-      <w:r>
-        <w:rPr>
-          <w:rFonts w:ascii="Times New Roman" w:hAnsi="Times New Roman"/>
-          <w:i/>
-          <w:sz w:val="18"/>
-        </w:rPr>
-        <w:t>Figure 2  Current Prisma entities and their document references</w:t>
-      </w:r>
-    </w:p>
-    <w:p>
-      <w:pPr>
-        <w:pageBreakBefore/>
-        <w:jc w:val="center"/>
-      </w:pPr>
-      <w:r>
-        <w:drawing>
-          <wp:inline xmlns:a="http://schemas.openxmlformats.org/drawingml/2006/main" xmlns:pic="http://schemas.openxmlformats.org/drawingml/2006/picture">
-            <wp:extent cx="4251960" cy="4089246"/>
-            <wp:docPr id="3" name="Picture 3" descr="Production Dashboard for the current Next.js MedBill D1 version"/>
-            <wp:cNvGraphicFramePr>
-              <a:graphicFrameLocks noChangeAspect="1"/>
-            </wp:cNvGraphicFramePr>
-            <a:graphic>
-              <a:graphicData uri="http://schemas.openxmlformats.org/drawingml/2006/picture">
-                <pic:pic>
-                  <pic:nvPicPr>
-                    <pic:cNvPr id="0" name="03-claim-validation.png"/>
-                    <pic:cNvPicPr/>
-                  </pic:nvPicPr>
-                  <pic:blipFill>
-                    <a:blip r:embed="rId16"/>
-                    <a:stretch>
-                      <a:fillRect/>
-                    </a:stretch>
-                  </pic:blipFill>
-                  <pic:spPr>
-                    <a:xfrm>
-                      <a:off x="0" y="0"/>
-                      <a:ext cx="4251960" cy="4089246"/>
-                    </a:xfrm>
-                    <a:prstGeom prst="rect"/>
-                  </pic:spPr>
-                </pic:pic>
-              </a:graphicData>
-            </a:graphic>
-          </wp:inline>
-        </w:drawing>
-      </w:r>
-    </w:p>
-    <w:p>
-      <w:pPr>
-        <w:spacing w:before="40" w:after="160"/>
-        <w:jc w:val="center"/>
-      </w:pPr>
-      <w:r>
-        <w:rPr>
-          <w:rFonts w:ascii="Times New Roman" w:hAnsi="Times New Roman"/>
-          <w:i/>
-          <w:sz w:val="18"/>
-        </w:rPr>
-        <w:t>Figure 3  Deployed dashboard after production verification</w:t>
-      </w:r>
-    </w:p>
-    <w:p>
-      <w:pPr>
         <w:keepNext/>
         <w:spacing w:before="140" w:after="60"/>
       </w:pPr>
       <w:r>
-        <w:rPr>
-          <w:rFonts w:ascii="Times New Roman" w:hAnsi="Times New Roman"/>
-          <w:b/>
-          <w:sz w:val="21"/>
-        </w:rPr>
         <w:t>Current limitations</w:t>
       </w:r>
     </w:p>
@@ -4889,11 +4169,7 @@
         <w:spacing w:after="40" w:line="252" w:lineRule="auto"/>
       </w:pPr>
       <w:r>
-        <w:rPr>
-          <w:rFonts w:ascii="Times New Roman" w:hAnsi="Times New Roman"/>
-          <w:sz w:val="20"/>
-        </w:rPr>
-        <w:t>The public demo accepts only synthetic PDFs, with a 4 MB upload cap and a 50-page extraction cap. Free hosting and AI quotas remain finite.</w:t>
+        <w:t>The public deployment is for synthetic data only. It has a 4 MB PDF upload limit and an eight-hour demo session.</w:t>
       </w:r>
     </w:p>
     <w:p>
@@ -4902,11 +4178,7 @@
         <w:spacing w:after="40" w:line="252" w:lineRule="auto"/>
       </w:pPr>
       <w:r>
-        <w:rPr>
-          <w:rFonts w:ascii="Times New Roman" w:hAnsi="Times New Roman"/>
-          <w:sz w:val="20"/>
-        </w:rPr>
-        <w:t>Checks identify field presence and code format; they do not verify insurer eligibility, code-set validity or claim reimbursement. Uncertain OCR goes to Needs review.</w:t>
+        <w:t>D1 checks validate required fields and recognizable formats. They do not verify insurer eligibility, medical necessity, official code-set status or reimbursement.</w:t>
       </w:r>
     </w:p>
     <w:p>
@@ -4915,11 +4187,7 @@
         <w:spacing w:after="40" w:line="252" w:lineRule="auto"/>
       </w:pPr>
       <w:r>
-        <w:rPr>
-          <w:rFonts w:ascii="Times New Roman" w:hAnsi="Times New Roman"/>
-          <w:sz w:val="20"/>
-        </w:rPr>
-        <w:t>Cloud language-model extraction is integrated, but a trained and evaluated denial-risk model is not. Patient CRUD, CMS-1500 creation, payments and financial reporting remain future work.</w:t>
+        <w:t>The CMS-1500-style screen is a printable preview, not an official electronic claim submission. Payment posting, denials, financial reports and a measured denial-risk model remain later work.</w:t>
       </w:r>
     </w:p>
     <w:p>
@@ -4944,11 +4212,7 @@
         <w:spacing w:after="100" w:line="269" w:lineRule="auto"/>
       </w:pPr>
       <w:r>
-        <w:rPr>
-          <w:rFonts w:ascii="Times New Roman" w:hAnsi="Times New Roman"/>
-          <w:sz w:val="21"/>
-        </w:rPr>
-        <w:t>Live app: https://medbill-steel.vercel.app. GitHub: https://github.com/hasanabdullah919/medbill_bsef23-51. D1 source snapshot: commit 3961a53; deployed runtime: f36bdcc. Production verification was completed on 13 October 2026.</w:t>
+        <w:t>Live app: https://medbill-steel.vercel.app. GitHub: https://github.com/hasanabdullah919/medbill_bsef23-51. D1 runtime source: commit de3e418. Vercel production deployment: dpl_JD4EnQXRBKWBn3kcnQY5UvmnUsMa. Production verification was completed on 14 October 2026.</w:t>
       </w:r>
     </w:p>
     <w:tbl>
@@ -4989,17 +4253,7 @@
             <w:shd w:fill="1F4E78"/>
           </w:tcPr>
           <w:p>
-            <w:pPr>
-              <w:spacing w:after="0" w:line="252" w:lineRule="auto"/>
-              <w:jc w:val="center"/>
-            </w:pPr>
-            <w:r>
-              <w:rPr>
-                <w:rFonts w:ascii="Times New Roman" w:hAnsi="Times New Roman"/>
-                <w:b/>
-                <w:color w:val="FFFFFF"/>
-                <w:sz w:val="18"/>
-              </w:rPr>
+            <w:r>
               <w:t>Evidence</w:t>
             </w:r>
           </w:p>
@@ -5017,17 +4271,7 @@
             <w:shd w:fill="1F4E78"/>
           </w:tcPr>
           <w:p>
-            <w:pPr>
-              <w:spacing w:after="0" w:line="252" w:lineRule="auto"/>
-              <w:jc w:val="center"/>
-            </w:pPr>
-            <w:r>
-              <w:rPr>
-                <w:rFonts w:ascii="Times New Roman" w:hAnsi="Times New Roman"/>
-                <w:b/>
-                <w:color w:val="FFFFFF"/>
-                <w:sz w:val="18"/>
-              </w:rPr>
+            <w:r>
               <w:t>Result</w:t>
             </w:r>
           </w:p>
@@ -5045,17 +4289,7 @@
             <w:shd w:fill="1F4E78"/>
           </w:tcPr>
           <w:p>
-            <w:pPr>
-              <w:spacing w:after="0" w:line="252" w:lineRule="auto"/>
-              <w:jc w:val="center"/>
-            </w:pPr>
-            <w:r>
-              <w:rPr>
-                <w:rFonts w:ascii="Times New Roman" w:hAnsi="Times New Roman"/>
-                <w:b/>
-                <w:color w:val="FFFFFF"/>
-                <w:sz w:val="18"/>
-              </w:rPr>
+            <w:r>
               <w:t>Meaning</w:t>
             </w:r>
           </w:p>
@@ -5077,15 +4311,8 @@
             </w:tcMar>
           </w:tcPr>
           <w:p>
-            <w:pPr>
-              <w:spacing w:after="0" w:line="252" w:lineRule="auto"/>
-            </w:pPr>
-            <w:r>
-              <w:rPr>
-                <w:rFonts w:ascii="Times New Roman" w:hAnsi="Times New Roman"/>
-                <w:sz w:val="18"/>
-              </w:rPr>
-              <w:t>Vercel health and services</w:t>
+            <w:r>
+              <w:t>Vercel health endpoint</w:t>
             </w:r>
           </w:p>
         </w:tc>
@@ -5101,14 +4328,7 @@
             </w:tcMar>
           </w:tcPr>
           <w:p>
-            <w:pPr>
-              <w:spacing w:after="0" w:line="252" w:lineRule="auto"/>
-            </w:pPr>
-            <w:r>
-              <w:rPr>
-                <w:rFonts w:ascii="Times New Roman" w:hAnsi="Times New Roman"/>
-                <w:sz w:val="18"/>
-              </w:rPr>
+            <w:r>
               <w:t>Passed</w:t>
             </w:r>
           </w:p>
@@ -5125,15 +4345,8 @@
             </w:tcMar>
           </w:tcPr>
           <w:p>
-            <w:pPr>
-              <w:spacing w:after="0" w:line="252" w:lineRule="auto"/>
-            </w:pPr>
-            <w:r>
-              <w:rPr>
-                <w:rFonts w:ascii="Times New Roman" w:hAnsi="Times New Roman"/>
-                <w:sz w:val="18"/>
-              </w:rPr>
-              <w:t>Real PostgreSQL and R2 connectivity</w:t>
+            <w:r>
+              <w:t>Production PostgreSQL and R2 are reachable</w:t>
             </w:r>
           </w:p>
         </w:tc>
@@ -5155,15 +4368,8 @@
             <w:shd w:fill="EEF4F8"/>
           </w:tcPr>
           <w:p>
-            <w:pPr>
-              <w:spacing w:after="0" w:line="252" w:lineRule="auto"/>
-            </w:pPr>
-            <w:r>
-              <w:rPr>
-                <w:rFonts w:ascii="Times New Roman" w:hAnsi="Times New Roman"/>
-                <w:sz w:val="18"/>
-              </w:rPr>
-              <w:t>Production API smoke checks</w:t>
+            <w:r>
+              <w:t>Local lint and production build</w:t>
             </w:r>
           </w:p>
         </w:tc>
@@ -5180,14 +4386,7 @@
             <w:shd w:fill="EEF4F8"/>
           </w:tcPr>
           <w:p>
-            <w:pPr>
-              <w:spacing w:after="0" w:line="252" w:lineRule="auto"/>
-            </w:pPr>
-            <w:r>
-              <w:rPr>
-                <w:rFonts w:ascii="Times New Roman" w:hAnsi="Times New Roman"/>
-                <w:sz w:val="18"/>
-              </w:rPr>
+            <w:r>
               <w:t>Passed</w:t>
             </w:r>
           </w:p>
@@ -5205,15 +4404,8 @@
             <w:shd w:fill="EEF4F8"/>
           </w:tcPr>
           <w:p>
-            <w:pPr>
-              <w:spacing w:after="0" w:line="252" w:lineRule="auto"/>
-            </w:pPr>
-            <w:r>
-              <w:rPr>
-                <w:rFonts w:ascii="Times New Roman" w:hAnsi="Times New Roman"/>
-                <w:sz w:val="18"/>
-              </w:rPr>
-              <w:t>Upload, guards, routing, PDF/report downloads and debug steps</w:t>
+            <w:r>
+              <w:t>ESLint, TypeScript and Next.js compilation succeeded</w:t>
             </w:r>
           </w:p>
         </w:tc>
@@ -5234,15 +4426,8 @@
             </w:tcMar>
           </w:tcPr>
           <w:p>
-            <w:pPr>
-              <w:spacing w:after="0" w:line="252" w:lineRule="auto"/>
-            </w:pPr>
-            <w:r>
-              <w:rPr>
-                <w:rFonts w:ascii="Times New Roman" w:hAnsi="Times New Roman"/>
-                <w:sz w:val="18"/>
-              </w:rPr>
-              <w:t>Browser batch runs</w:t>
+            <w:r>
+              <w:t>Local Playwright suite</w:t>
             </w:r>
           </w:p>
         </w:tc>
@@ -5258,15 +4443,8 @@
             </w:tcMar>
           </w:tcPr>
           <w:p>
-            <w:pPr>
-              <w:spacing w:after="0" w:line="252" w:lineRule="auto"/>
-            </w:pPr>
-            <w:r>
-              <w:rPr>
-                <w:rFonts w:ascii="Times New Roman" w:hAnsi="Times New Roman"/>
-                <w:sz w:val="18"/>
-              </w:rPr>
-              <w:t>Passed</w:t>
+            <w:r>
+              <w:t>5 of 5 passed</w:t>
             </w:r>
           </w:p>
         </w:tc>
@@ -5282,15 +4460,8 @@
             </w:tcMar>
           </w:tcPr>
           <w:p>
-            <w:pPr>
-              <w:spacing w:after="0" w:line="252" w:lineRule="auto"/>
-            </w:pPr>
-            <w:r>
-              <w:rPr>
-                <w:rFonts w:ascii="Times New Roman" w:hAnsi="Times New Roman"/>
-                <w:sz w:val="18"/>
-              </w:rPr>
-              <w:t>Two-file debug and three-file complete run; all output categories</w:t>
+            <w:r>
+              <w:t>Authentication, manual flow, PDF flow, invalid login and admin access</w:t>
             </w:r>
           </w:p>
         </w:tc>
@@ -5312,15 +4483,8 @@
             <w:shd w:fill="EEF4F8"/>
           </w:tcPr>
           <w:p>
-            <w:pPr>
-              <w:spacing w:after="0" w:line="252" w:lineRule="auto"/>
-            </w:pPr>
-            <w:r>
-              <w:rPr>
-                <w:rFonts w:ascii="Times New Roman" w:hAnsi="Times New Roman"/>
-                <w:sz w:val="18"/>
-              </w:rPr>
-              <w:t>Forced OCR on Vercel</w:t>
+            <w:r>
+              <w:t>Production Playwright suite</w:t>
             </w:r>
           </w:p>
         </w:tc>
@@ -5337,15 +4501,8 @@
             <w:shd w:fill="EEF4F8"/>
           </w:tcPr>
           <w:p>
-            <w:pPr>
-              <w:spacing w:after="0" w:line="252" w:lineRule="auto"/>
-            </w:pPr>
-            <w:r>
-              <w:rPr>
-                <w:rFonts w:ascii="Times New Roman" w:hAnsi="Times New Roman"/>
-                <w:sz w:val="18"/>
-              </w:rPr>
-              <w:t>94% confidence; 0 AI calls</w:t>
+            <w:r>
+              <w:t>5 of 5 passed</w:t>
             </w:r>
           </w:p>
         </w:tc>
@@ -5362,15 +4519,8 @@
             <w:shd w:fill="EEF4F8"/>
           </w:tcPr>
           <w:p>
-            <w:pPr>
-              <w:spacing w:after="0" w:line="252" w:lineRule="auto"/>
-            </w:pPr>
-            <w:r>
-              <w:rPr>
-                <w:rFonts w:ascii="Times New Roman" w:hAnsi="Times New Roman"/>
-                <w:sz w:val="18"/>
-              </w:rPr>
-              <w:t>One synthetic page; engine estimate, not general accuracy</w:t>
+            <w:r>
+              <w:t>The same complete behavior passed on the live URL</w:t>
             </w:r>
           </w:p>
         </w:tc>
@@ -5391,15 +4541,8 @@
             </w:tcMar>
           </w:tcPr>
           <w:p>
-            <w:pPr>
-              <w:spacing w:after="0" w:line="252" w:lineRule="auto"/>
-            </w:pPr>
-            <w:r>
-              <w:rPr>
-                <w:rFonts w:ascii="Times New Roman" w:hAnsi="Times New Roman"/>
-                <w:sz w:val="18"/>
-              </w:rPr>
-              <w:t>Backup/reset and physical R2 listing</w:t>
+            <w:r>
+              <w:t>Prisma migration</w:t>
             </w:r>
           </w:p>
         </w:tc>
@@ -5415,15 +4558,8 @@
             </w:tcMar>
           </w:tcPr>
           <w:p>
-            <w:pPr>
-              <w:spacing w:after="0" w:line="252" w:lineRule="auto"/>
-            </w:pPr>
-            <w:r>
-              <w:rPr>
-                <w:rFonts w:ascii="Times New Roman" w:hAnsi="Times New Roman"/>
-                <w:sz w:val="18"/>
-              </w:rPr>
-              <w:t>Passed</w:t>
+            <w:r>
+              <w:t>Applied</w:t>
             </w:r>
           </w:p>
         </w:tc>
@@ -5439,15 +4575,8 @@
             </w:tcMar>
           </w:tcPr>
           <w:p>
-            <w:pPr>
-              <w:spacing w:after="0" w:line="252" w:lineRule="auto"/>
-            </w:pPr>
-            <w:r>
-              <w:rPr>
-                <w:rFonts w:ascii="Times New Roman" w:hAnsi="Times New Roman"/>
-                <w:sz w:val="18"/>
-              </w:rPr>
-              <w:t>Output emptied, files restored, backup preserved</w:t>
+            <w:r>
+              <w:t>Patient, Insurance and Claim tables exist in production PostgreSQL</w:t>
             </w:r>
           </w:p>
         </w:tc>
@@ -5469,15 +4598,8 @@
             <w:shd w:fill="EEF4F8"/>
           </w:tcPr>
           <w:p>
-            <w:pPr>
-              <w:spacing w:after="0" w:line="252" w:lineRule="auto"/>
-            </w:pPr>
-            <w:r>
-              <w:rPr>
-                <w:rFonts w:ascii="Times New Roman" w:hAnsi="Times New Roman"/>
-                <w:sz w:val="18"/>
-              </w:rPr>
-              <w:t>Build, lint and production audit</w:t>
+            <w:r>
+              <w:t>Unauthenticated document API</w:t>
             </w:r>
           </w:p>
         </w:tc>
@@ -5494,15 +4616,8 @@
             <w:shd w:fill="EEF4F8"/>
           </w:tcPr>
           <w:p>
-            <w:pPr>
-              <w:spacing w:after="0" w:line="252" w:lineRule="auto"/>
-            </w:pPr>
-            <w:r>
-              <w:rPr>
-                <w:rFonts w:ascii="Times New Roman" w:hAnsi="Times New Roman"/>
-                <w:sz w:val="18"/>
-              </w:rPr>
-              <w:t>Passed; 0 runtime advisories</w:t>
+            <w:r>
+              <w:t>HTTP 401</w:t>
             </w:r>
           </w:p>
         </w:tc>
@@ -5519,15 +4634,8 @@
             <w:shd w:fill="EEF4F8"/>
           </w:tcPr>
           <w:p>
-            <w:pPr>
-              <w:spacing w:after="0" w:line="252" w:lineRule="auto"/>
-            </w:pPr>
-            <w:r>
-              <w:rPr>
-                <w:rFonts w:ascii="Times New Roman" w:hAnsi="Times New Roman"/>
-                <w:sz w:val="18"/>
-              </w:rPr>
-              <w:t>Five high development-tool advisories remain</w:t>
+            <w:r>
+              <w:t>Older PDF data is no longer publicly accessible</w:t>
             </w:r>
           </w:p>
         </w:tc>
@@ -5538,11 +4646,7 @@
         <w:spacing w:after="100" w:line="269" w:lineRule="auto"/>
       </w:pPr>
       <w:r>
-        <w:rPr>
-          <w:rFonts w:ascii="Times New Roman" w:hAnsi="Times New Roman"/>
-          <w:sz w:val="21"/>
-        </w:rPr>
-        <w:t>The evidence folder includes current diagrams, the dashboard screenshot and the recorded production checks. Eight distinct synthetic demo PDFs are included. Source code is frozen separately without credentials, dependencies, build output or the earlier Django prototype.</w:t>
+        <w:t>The evidence folder includes the live D1 workspace screenshot and the production test record. Synthetic PDFs support the extraction demonstration. The repository contains the active source, Prisma migration and browser tests without credentials, dependencies or generated build output.</w:t>
       </w:r>
     </w:p>
     <w:p>
@@ -5567,11 +4671,7 @@
         <w:spacing w:after="100" w:line="269" w:lineRule="auto"/>
       </w:pPr>
       <w:r>
-        <w:rPr>
-          <w:rFonts w:ascii="Times New Roman" w:hAnsi="Times New Roman"/>
-          <w:sz w:val="21"/>
-        </w:rPr>
-        <w:t>A story is Done when its stated UI, API, storage and database behavior has been observed with synthetic data. Planned review and CI policies below are not claimed as completed activities.</w:t>
+        <w:t>A story is Done only when its stated D1 behavior passes with synthetic data. This does not mean payer integration or the wider product is complete.</w:t>
       </w:r>
     </w:p>
     <w:p>
@@ -5580,11 +4680,7 @@
         <w:spacing w:after="40" w:line="252" w:lineRule="auto"/>
       </w:pPr>
       <w:r>
-        <w:rPr>
-          <w:rFonts w:ascii="Times New Roman" w:hAnsi="Times New Roman"/>
-          <w:sz w:val="20"/>
-        </w:rPr>
-        <w:t>The story has an observable acceptance check and a backlog ID.</w:t>
+        <w:t>Protected pages and APIs require a valid role-checked session.</w:t>
       </w:r>
     </w:p>
     <w:p>
@@ -5593,11 +4689,7 @@
         <w:spacing w:after="40" w:line="252" w:lineRule="auto"/>
       </w:pPr>
       <w:r>
-        <w:rPr>
-          <w:rFonts w:ascii="Times New Roman" w:hAnsi="Times New Roman"/>
-          <w:sz w:val="20"/>
-        </w:rPr>
-        <w:t>Validation and file routing run on the backend; future restricted features require backend authorization.</w:t>
+        <w:t>Manual and PDF inputs reach the same review, validation, persistence and preview path.</w:t>
       </w:r>
     </w:p>
     <w:p>
@@ -5606,11 +4698,7 @@
         <w:spacing w:after="40" w:line="252" w:lineRule="auto"/>
       </w:pPr>
       <w:r>
-        <w:rPr>
-          <w:rFonts w:ascii="Times New Roman" w:hAnsi="Times New Roman"/>
-          <w:sz w:val="20"/>
-        </w:rPr>
-        <w:t>The UI, API, PostgreSQL and R2 paths work together with synthetic data.</w:t>
+        <w:t>Lint, build, migration, local tests and production tests pass.</w:t>
       </w:r>
     </w:p>
     <w:p>
@@ -5619,63 +4707,7 @@
         <w:spacing w:after="40" w:line="252" w:lineRule="auto"/>
       </w:pPr>
       <w:r>
-        <w:rPr>
-          <w:rFonts w:ascii="Times New Roman" w:hAnsi="Times New Roman"/>
-          <w:sz w:val="20"/>
-        </w:rPr>
-        <w:t>Happy, invalid-input and failure cases have recorded checks; repeatable API tests are included.</w:t>
-      </w:r>
-    </w:p>
-    <w:p>
-      <w:pPr>
-        <w:pStyle w:val="ListBullet"/>
-        <w:spacing w:after="40" w:line="252" w:lineRule="auto"/>
-      </w:pPr>
-      <w:r>
-        <w:rPr>
-          <w:rFonts w:ascii="Times New Roman" w:hAnsi="Times New Roman"/>
-          <w:sz w:val="20"/>
-        </w:rPr>
-        <w:t>The Next.js production build succeeds and the deployed health endpoint checks both services.</w:t>
-      </w:r>
-    </w:p>
-    <w:p>
-      <w:pPr>
-        <w:pStyle w:val="ListBullet"/>
-        <w:spacing w:after="40" w:line="252" w:lineRule="auto"/>
-      </w:pPr>
-      <w:r>
-        <w:rPr>
-          <w:rFonts w:ascii="Times New Roman" w:hAnsi="Times New Roman"/>
-          <w:sz w:val="20"/>
-        </w:rPr>
-        <w:t>No API keys, passwords, private records, environment files or generated dependencies enter the submission.</w:t>
-      </w:r>
-    </w:p>
-    <w:p>
-      <w:pPr>
-        <w:pStyle w:val="ListBullet"/>
-        <w:spacing w:after="40" w:line="252" w:lineRule="auto"/>
-      </w:pPr>
-      <w:r>
-        <w:rPr>
-          <w:rFonts w:ascii="Times New Roman" w:hAnsi="Times New Roman"/>
-          <w:sz w:val="20"/>
-        </w:rPr>
-        <w:t>A team review and supervisor scope confirmation are required before calling a broader release approved.</w:t>
-      </w:r>
-    </w:p>
-    <w:p>
-      <w:pPr>
-        <w:pStyle w:val="ListBullet"/>
-        <w:spacing w:after="40" w:line="252" w:lineRule="auto"/>
-      </w:pPr>
-      <w:r>
-        <w:rPr>
-          <w:rFonts w:ascii="Times New Roman" w:hAnsi="Times New Roman"/>
-          <w:sz w:val="20"/>
-        </w:rPr>
-        <w:t>The report, backlog, source snapshot and screenshots describe the same demonstrated increment.</w:t>
+        <w:t>The interface and report state the D1 boundary and use no private data or secrets.</w:t>
       </w:r>
     </w:p>
     <w:p>
@@ -5700,11 +4732,7 @@
         <w:spacing w:after="100" w:line="269" w:lineRule="auto"/>
       </w:pPr>
       <w:r>
-        <w:rPr>
-          <w:rFonts w:ascii="Times New Roman" w:hAnsi="Times New Roman"/>
-          <w:sz w:val="21"/>
-        </w:rPr>
-        <w:t>The proposal uses two-week Scrum sprints, with planning, review and retrospective. This increment proves a complete document-processing path. Future sprints should add tested billing features rather than disconnected screens. Sprint ceremony records and completed peer reviews are not supplied as evidence.</w:t>
+        <w:t>The proposal uses two-week Scrum sprints with planning, review and retrospective. This increment delivers one vertical slice from claim input to a stored, printable draft. Later sprints should extend that path with payer integration, payment and denial workflows, reporting and measured machine-learning evidence.</w:t>
       </w:r>
     </w:p>
     <w:p>
@@ -5727,11 +4755,7 @@
         <w:spacing w:after="40" w:line="252" w:lineRule="auto"/>
       </w:pPr>
       <w:r>
-        <w:rPr>
-          <w:rFonts w:ascii="Times New Roman" w:hAnsi="Times New Roman"/>
-          <w:sz w:val="20"/>
-        </w:rPr>
-        <w:t>main currently contains the published application and documentation commits.</w:t>
+        <w:t>main contains the published D1 application and aligned submission documentation.</w:t>
       </w:r>
     </w:p>
     <w:p>
@@ -5740,11 +4764,7 @@
         <w:spacing w:after="40" w:line="252" w:lineRule="auto"/>
       </w:pPr>
       <w:r>
-        <w:rPr>
-          <w:rFonts w:ascii="Times New Roman" w:hAnsi="Times New Roman"/>
-          <w:sz w:val="20"/>
-        </w:rPr>
-        <w:t>A develop branch is planned for integrated sprint work; this package does not claim it is enforced.</w:t>
+        <w:t>Feature and fix branches remain the proposed path for isolated sprint work.</w:t>
       </w:r>
     </w:p>
     <w:p>
@@ -5753,11 +4773,7 @@
         <w:spacing w:after="40" w:line="252" w:lineRule="auto"/>
       </w:pPr>
       <w:r>
-        <w:rPr>
-          <w:rFonts w:ascii="Times New Roman" w:hAnsi="Times New Roman"/>
-          <w:sz w:val="20"/>
-        </w:rPr>
-        <w:t>Feature/fix branches, pull-request review and protected checks are the proposed team workflow.</w:t>
+        <w:t>Pull-request review, protected checks and a develop integration branch remain planned team controls.</w:t>
       </w:r>
     </w:p>
     <w:p>
@@ -5779,11 +4795,7 @@
         <w:spacing w:after="100" w:line="269" w:lineRule="auto"/>
       </w:pPr>
       <w:r>
-        <w:rPr>
-          <w:rFonts w:ascii="Times New Roman" w:hAnsi="Times New Roman"/>
-          <w:sz w:val="21"/>
-        </w:rPr>
-        <w:t>Planned workflow: refine a story, implement a vertical slice, run checks, obtain peer review, demonstrate it and update the report. Current deployment uses Vercel CLI; automatic GitHub deployment and a hosted CI workflow are not enabled.</w:t>
+        <w:t>Planned workflow: refine a story, implement a vertical slice, run lint/build/tests, obtain peer review, demonstrate the deployed behavior and update the report. Current production deployment uses Vercel CLI; automatic GitHub deployment and hosted CI are not enabled.</w:t>
       </w:r>
     </w:p>
     <w:p>
@@ -5861,11 +4873,7 @@
         <w:spacing w:after="100" w:line="269" w:lineRule="auto"/>
       </w:pPr>
       <w:r>
-        <w:rPr>
-          <w:rFonts w:ascii="Times New Roman" w:hAnsi="Times New Roman"/>
-          <w:sz w:val="21"/>
-        </w:rPr>
-        <w:t>Current checks are executed before manual deployment. Hosted GitHub Actions and protected-branch gates are planned. Vercel builds the Next.js app; successful compilation alone is insufficient, so real production endpoints and file movement are also checked.</w:t>
+        <w:t>Current checks run before manual deployment. Hosted GitHub Actions and protected-branch gates remain planned. Vercel builds the Next.js application, while Playwright verifies the complete user flow against the deployed URL.</w:t>
       </w:r>
     </w:p>
     <w:tbl>
@@ -5906,17 +4914,7 @@
             <w:shd w:fill="1F4E78"/>
           </w:tcPr>
           <w:p>
-            <w:pPr>
-              <w:spacing w:after="0" w:line="252" w:lineRule="auto"/>
-              <w:jc w:val="center"/>
-            </w:pPr>
-            <w:r>
-              <w:rPr>
-                <w:rFonts w:ascii="Times New Roman" w:hAnsi="Times New Roman"/>
-                <w:b/>
-                <w:color w:val="FFFFFF"/>
-                <w:sz w:val="18"/>
-              </w:rPr>
+            <w:r>
               <w:t>Stage</w:t>
             </w:r>
           </w:p>
@@ -5934,17 +4932,7 @@
             <w:shd w:fill="1F4E78"/>
           </w:tcPr>
           <w:p>
-            <w:pPr>
-              <w:spacing w:after="0" w:line="252" w:lineRule="auto"/>
-              <w:jc w:val="center"/>
-            </w:pPr>
-            <w:r>
-              <w:rPr>
-                <w:rFonts w:ascii="Times New Roman" w:hAnsi="Times New Roman"/>
-                <w:b/>
-                <w:color w:val="FFFFFF"/>
-                <w:sz w:val="18"/>
-              </w:rPr>
+            <w:r>
               <w:t>Check</w:t>
             </w:r>
           </w:p>
@@ -5962,17 +4950,7 @@
             <w:shd w:fill="1F4E78"/>
           </w:tcPr>
           <w:p>
-            <w:pPr>
-              <w:spacing w:after="0" w:line="252" w:lineRule="auto"/>
-              <w:jc w:val="center"/>
-            </w:pPr>
-            <w:r>
-              <w:rPr>
-                <w:rFonts w:ascii="Times New Roman" w:hAnsi="Times New Roman"/>
-                <w:b/>
-                <w:color w:val="FFFFFF"/>
-                <w:sz w:val="18"/>
-              </w:rPr>
+            <w:r>
               <w:t>Current state or planned gate</w:t>
             </w:r>
           </w:p>
@@ -5994,14 +4972,7 @@
             </w:tcMar>
           </w:tcPr>
           <w:p>
-            <w:pPr>
-              <w:spacing w:after="0" w:line="252" w:lineRule="auto"/>
-            </w:pPr>
-            <w:r>
-              <w:rPr>
-                <w:rFonts w:ascii="Times New Roman" w:hAnsi="Times New Roman"/>
-                <w:sz w:val="18"/>
-              </w:rPr>
+            <w:r>
               <w:t>Local code</w:t>
             </w:r>
           </w:p>
@@ -6018,15 +4989,8 @@
             </w:tcMar>
           </w:tcPr>
           <w:p>
-            <w:pPr>
-              <w:spacing w:after="0" w:line="252" w:lineRule="auto"/>
-            </w:pPr>
-            <w:r>
-              <w:rPr>
-                <w:rFonts w:ascii="Times New Roman" w:hAnsi="Times New Roman"/>
-                <w:sz w:val="18"/>
-              </w:rPr>
-              <w:t>npm run lint; npm run build</w:t>
+            <w:r>
+              <w:t>npm run lint; npm run build; npm test</w:t>
             </w:r>
           </w:p>
         </w:tc>
@@ -6042,15 +5006,8 @@
             </w:tcMar>
           </w:tcPr>
           <w:p>
-            <w:pPr>
-              <w:spacing w:after="0" w:line="252" w:lineRule="auto"/>
-            </w:pPr>
-            <w:r>
-              <w:rPr>
-                <w:rFonts w:ascii="Times New Roman" w:hAnsi="Times New Roman"/>
-                <w:sz w:val="18"/>
-              </w:rPr>
-              <w:t>Executed; required before deployment</w:t>
+            <w:r>
+              <w:t>Executed before deployment</w:t>
             </w:r>
           </w:p>
         </w:tc>
@@ -6072,14 +5029,7 @@
             <w:shd w:fill="EEF4F8"/>
           </w:tcPr>
           <w:p>
-            <w:pPr>
-              <w:spacing w:after="0" w:line="252" w:lineRule="auto"/>
-            </w:pPr>
-            <w:r>
-              <w:rPr>
-                <w:rFonts w:ascii="Times New Roman" w:hAnsi="Times New Roman"/>
-                <w:sz w:val="18"/>
-              </w:rPr>
+            <w:r>
               <w:t>Database</w:t>
             </w:r>
           </w:p>
@@ -6097,14 +5047,7 @@
             <w:shd w:fill="EEF4F8"/>
           </w:tcPr>
           <w:p>
-            <w:pPr>
-              <w:spacing w:after="0" w:line="252" w:lineRule="auto"/>
-            </w:pPr>
-            <w:r>
-              <w:rPr>
-                <w:rFonts w:ascii="Times New Roman" w:hAnsi="Times New Roman"/>
-                <w:sz w:val="18"/>
-              </w:rPr>
+            <w:r>
               <w:t>Prisma generation and migrations</w:t>
             </w:r>
           </w:p>
@@ -6122,15 +5065,8 @@
             <w:shd w:fill="EEF4F8"/>
           </w:tcPr>
           <w:p>
-            <w:pPr>
-              <w:spacing w:after="0" w:line="252" w:lineRule="auto"/>
-            </w:pPr>
-            <w:r>
-              <w:rPr>
-                <w:rFonts w:ascii="Times New Roman" w:hAnsi="Times New Roman"/>
-                <w:sz w:val="18"/>
-              </w:rPr>
-              <w:t>Applied to PostgreSQL</w:t>
+            <w:r>
+              <w:t>Applied to production PostgreSQL</w:t>
             </w:r>
           </w:p>
         </w:tc>
@@ -6151,14 +5087,7 @@
             </w:tcMar>
           </w:tcPr>
           <w:p>
-            <w:pPr>
-              <w:spacing w:after="0" w:line="252" w:lineRule="auto"/>
-            </w:pPr>
-            <w:r>
-              <w:rPr>
-                <w:rFonts w:ascii="Times New Roman" w:hAnsi="Times New Roman"/>
-                <w:sz w:val="18"/>
-              </w:rPr>
+            <w:r>
               <w:t>Live system</w:t>
             </w:r>
           </w:p>
@@ -6175,15 +5104,8 @@
             </w:tcMar>
           </w:tcPr>
           <w:p>
-            <w:pPr>
-              <w:spacing w:after="0" w:line="252" w:lineRule="auto"/>
-            </w:pPr>
-            <w:r>
-              <w:rPr>
-                <w:rFonts w:ascii="Times New Roman" w:hAnsi="Times New Roman"/>
-                <w:sz w:val="18"/>
-              </w:rPr>
-              <w:t>API smoke checks, browser demo, R2 folder listing</w:t>
+            <w:r>
+              <w:t>Playwright against production plus health/API checks</w:t>
             </w:r>
           </w:p>
         </w:tc>
@@ -6199,15 +5121,8 @@
             </w:tcMar>
           </w:tcPr>
           <w:p>
-            <w:pPr>
-              <w:spacing w:after="0" w:line="252" w:lineRule="auto"/>
-            </w:pPr>
-            <w:r>
-              <w:rPr>
-                <w:rFonts w:ascii="Times New Roman" w:hAnsi="Times New Roman"/>
-                <w:sz w:val="18"/>
-              </w:rPr>
-              <w:t>Executed on production</w:t>
+            <w:r>
+              <w:t>Executed after deployment</w:t>
             </w:r>
           </w:p>
         </w:tc>
@@ -6229,14 +5144,7 @@
             <w:shd w:fill="EEF4F8"/>
           </w:tcPr>
           <w:p>
-            <w:pPr>
-              <w:spacing w:after="0" w:line="252" w:lineRule="auto"/>
-            </w:pPr>
-            <w:r>
-              <w:rPr>
-                <w:rFonts w:ascii="Times New Roman" w:hAnsi="Times New Roman"/>
-                <w:sz w:val="18"/>
-              </w:rPr>
+            <w:r>
               <w:t>Hosted CI</w:t>
             </w:r>
           </w:p>
@@ -6254,14 +5162,7 @@
             <w:shd w:fill="EEF4F8"/>
           </w:tcPr>
           <w:p>
-            <w:pPr>
-              <w:spacing w:after="0" w:line="252" w:lineRule="auto"/>
-            </w:pPr>
-            <w:r>
-              <w:rPr>
-                <w:rFonts w:ascii="Times New Roman" w:hAnsi="Times New Roman"/>
-                <w:sz w:val="18"/>
-              </w:rPr>
+            <w:r>
               <w:t>GitHub Actions, peer review and protected branches</w:t>
             </w:r>
           </w:p>
@@ -6279,32 +5180,13 @@
             <w:shd w:fill="EEF4F8"/>
           </w:tcPr>
           <w:p>
-            <w:pPr>
-              <w:spacing w:after="0" w:line="252" w:lineRule="auto"/>
-            </w:pPr>
-            <w:r>
-              <w:rPr>
-                <w:rFonts w:ascii="Times New Roman" w:hAnsi="Times New Roman"/>
-                <w:sz w:val="18"/>
-              </w:rPr>
-              <w:t>Planned; block promotion once configured</w:t>
+            <w:r>
+              <w:t>Planned</w:t>
             </w:r>
           </w:p>
         </w:tc>
       </w:tr>
     </w:tbl>
-    <w:p>
-      <w:pPr>
-        <w:spacing w:after="100" w:line="269" w:lineRule="auto"/>
-      </w:pPr>
-      <w:r>
-        <w:rPr>
-          <w:rFonts w:ascii="Times New Roman" w:hAnsi="Times New Roman"/>
-          <w:sz w:val="21"/>
-        </w:rPr>
-        <w:t>Keep credentials in server-side environment variables, apply Prisma migrations before first use, deploy with Vercel CLI and verify /api/health plus a synthetic run. Repeat backup/reset checks on a test workspace. Free-tier quotas and public-demo privacy restrictions remain operational constraints.</w:t>
-      </w:r>
-    </w:p>
     <w:p>
       <w:pPr>
         <w:pStyle w:val="Heading1"/>
@@ -6359,17 +5241,7 @@
             <w:shd w:fill="1F4E78"/>
           </w:tcPr>
           <w:p>
-            <w:pPr>
-              <w:spacing w:after="0" w:line="252" w:lineRule="auto"/>
-              <w:jc w:val="center"/>
-            </w:pPr>
-            <w:r>
-              <w:rPr>
-                <w:rFonts w:ascii="Times New Roman" w:hAnsi="Times New Roman"/>
-                <w:b/>
-                <w:color w:val="FFFFFF"/>
-                <w:sz w:val="18"/>
-              </w:rPr>
+            <w:r>
               <w:t>Target</w:t>
             </w:r>
           </w:p>
@@ -6387,17 +5259,7 @@
             <w:shd w:fill="1F4E78"/>
           </w:tcPr>
           <w:p>
-            <w:pPr>
-              <w:spacing w:after="0" w:line="252" w:lineRule="auto"/>
-              <w:jc w:val="center"/>
-            </w:pPr>
-            <w:r>
-              <w:rPr>
-                <w:rFonts w:ascii="Times New Roman" w:hAnsi="Times New Roman"/>
-                <w:b/>
-                <w:color w:val="FFFFFF"/>
-                <w:sz w:val="18"/>
-              </w:rPr>
+            <w:r>
               <w:t>Planned outcome</w:t>
             </w:r>
           </w:p>
@@ -6419,14 +5281,7 @@
             </w:tcMar>
           </w:tcPr>
           <w:p>
-            <w:pPr>
-              <w:spacing w:after="0" w:line="252" w:lineRule="auto"/>
-            </w:pPr>
-            <w:r>
-              <w:rPr>
-                <w:rFonts w:ascii="Times New Roman" w:hAnsi="Times New Roman"/>
-                <w:sz w:val="18"/>
-              </w:rPr>
+            <w:r>
               <w:t>Scope review</w:t>
             </w:r>
           </w:p>
@@ -6443,15 +5298,8 @@
             </w:tcMar>
           </w:tcPr>
           <w:p>
-            <w:pPr>
-              <w:spacing w:after="0" w:line="252" w:lineRule="auto"/>
-            </w:pPr>
-            <w:r>
-              <w:rPr>
-                <w:rFonts w:ascii="Times New Roman" w:hAnsi="Times New Roman"/>
-                <w:sz w:val="18"/>
-              </w:rPr>
-              <w:t>Confirm the D1 PDF increment and stack changes against the proposal.</w:t>
+            <w:r>
+              <w:t>Confirm the D1 claim-intake, validation and preview slice against the proposal.</w:t>
             </w:r>
           </w:p>
         </w:tc>
@@ -6473,14 +5321,7 @@
             <w:shd w:fill="EEF4F8"/>
           </w:tcPr>
           <w:p>
-            <w:pPr>
-              <w:spacing w:after="0" w:line="252" w:lineRule="auto"/>
-            </w:pPr>
-            <w:r>
-              <w:rPr>
-                <w:rFonts w:ascii="Times New Roman" w:hAnsi="Times New Roman"/>
-                <w:sz w:val="18"/>
-              </w:rPr>
+            <w:r>
               <w:t>Sprint 1</w:t>
             </w:r>
           </w:p>
@@ -6498,15 +5339,8 @@
             <w:shd w:fill="EEF4F8"/>
           </w:tcPr>
           <w:p>
-            <w:pPr>
-              <w:spacing w:after="0" w:line="252" w:lineRule="auto"/>
-            </w:pPr>
-            <w:r>
-              <w:rPr>
-                <w:rFonts w:ascii="Times New Roman" w:hAnsi="Times New Roman"/>
-                <w:sz w:val="18"/>
-              </w:rPr>
-              <w:t>Add authentication, roles, patient/insurance management and accountable audit events.</w:t>
+            <w:r>
+              <w:t>Add full patient/policy search, editing, deduplication and audit events.</w:t>
             </w:r>
           </w:p>
         </w:tc>
@@ -6527,14 +5361,7 @@
             </w:tcMar>
           </w:tcPr>
           <w:p>
-            <w:pPr>
-              <w:spacing w:after="0" w:line="252" w:lineRule="auto"/>
-            </w:pPr>
-            <w:r>
-              <w:rPr>
-                <w:rFonts w:ascii="Times New Roman" w:hAnsi="Times New Roman"/>
-                <w:sz w:val="18"/>
-              </w:rPr>
+            <w:r>
               <w:t>Sprint 2</w:t>
             </w:r>
           </w:p>
@@ -6551,15 +5378,8 @@
             </w:tcMar>
           </w:tcPr>
           <w:p>
-            <w:pPr>
-              <w:spacing w:after="0" w:line="252" w:lineRule="auto"/>
-            </w:pPr>
-            <w:r>
-              <w:rPr>
-                <w:rFonts w:ascii="Times New Roman" w:hAnsi="Times New Roman"/>
-                <w:sz w:val="18"/>
-              </w:rPr>
-              <w:t>Implement charges, permitted code lookup, claim states and CMS-1500 PDF generation.</w:t>
+            <w:r>
+              <w:t>Confirm official CMS-1500 export and payer submission requirements; add code and eligibility services.</w:t>
             </w:r>
           </w:p>
         </w:tc>
@@ -6581,14 +5401,7 @@
             <w:shd w:fill="EEF4F8"/>
           </w:tcPr>
           <w:p>
-            <w:pPr>
-              <w:spacing w:after="0" w:line="252" w:lineRule="auto"/>
-            </w:pPr>
-            <w:r>
-              <w:rPr>
-                <w:rFonts w:ascii="Times New Roman" w:hAnsi="Times New Roman"/>
-                <w:sz w:val="18"/>
-              </w:rPr>
+            <w:r>
               <w:t>Sprint 3</w:t>
             </w:r>
           </w:p>
@@ -6606,15 +5419,8 @@
             <w:shd w:fill="EEF4F8"/>
           </w:tcPr>
           <w:p>
-            <w:pPr>
-              <w:spacing w:after="0" w:line="252" w:lineRule="auto"/>
-            </w:pPr>
-            <w:r>
-              <w:rPr>
-                <w:rFonts w:ascii="Times New Roman" w:hAnsi="Times New Roman"/>
-                <w:sz w:val="18"/>
-              </w:rPr>
-              <w:t>Add payment, adjustment, denial and outstanding-balance logic with fixtures.</w:t>
+            <w:r>
+              <w:t>Implement payment, adjustment, denial and outstanding-balance workflows with fixtures.</w:t>
             </w:r>
           </w:p>
         </w:tc>
@@ -6635,14 +5441,7 @@
             </w:tcMar>
           </w:tcPr>
           <w:p>
-            <w:pPr>
-              <w:spacing w:after="0" w:line="252" w:lineRule="auto"/>
-            </w:pPr>
-            <w:r>
-              <w:rPr>
-                <w:rFonts w:ascii="Times New Roman" w:hAnsi="Times New Roman"/>
-                <w:sz w:val="18"/>
-              </w:rPr>
+            <w:r>
               <w:t>Sprint 4</w:t>
             </w:r>
           </w:p>
@@ -6659,15 +5458,8 @@
             </w:tcMar>
           </w:tcPr>
           <w:p>
-            <w:pPr>
-              <w:spacing w:after="0" w:line="252" w:lineRule="auto"/>
-            </w:pPr>
-            <w:r>
-              <w:rPr>
-                <w:rFonts w:ascii="Times New Roman" w:hAnsi="Times New Roman"/>
-                <w:sz w:val="18"/>
-              </w:rPr>
-              <w:t>Build reconciled financial reports and an approved, measured ML experiment.</w:t>
+            <w:r>
+              <w:t>Build reconciled reports and an approved, measured denial-risk experiment.</w:t>
             </w:r>
           </w:p>
         </w:tc>
@@ -6689,14 +5481,7 @@
             <w:shd w:fill="EEF4F8"/>
           </w:tcPr>
           <w:p>
-            <w:pPr>
-              <w:spacing w:after="0" w:line="252" w:lineRule="auto"/>
-            </w:pPr>
-            <w:r>
-              <w:rPr>
-                <w:rFonts w:ascii="Times New Roman" w:hAnsi="Times New Roman"/>
-                <w:sz w:val="18"/>
-              </w:rPr>
+            <w:r>
               <w:t>Release</w:t>
             </w:r>
           </w:p>
@@ -6714,15 +5499,8 @@
             <w:shd w:fill="EEF4F8"/>
           </w:tcPr>
           <w:p>
-            <w:pPr>
-              <w:spacing w:after="0" w:line="252" w:lineRule="auto"/>
-            </w:pPr>
-            <w:r>
-              <w:rPr>
-                <w:rFonts w:ascii="Times New Roman" w:hAnsi="Times New Roman"/>
-                <w:sz w:val="18"/>
-              </w:rPr>
-              <w:t>Configure CI/review gates, privacy controls, regression/UAT, monitoring and documentation.</w:t>
+            <w:r>
+              <w:t>Add CI/review gates, operational identity controls, monitoring and privacy review.</w:t>
             </w:r>
           </w:p>
         </w:tc>
@@ -6733,11 +5511,7 @@
         <w:spacing w:after="100" w:line="269" w:lineRule="auto"/>
       </w:pPr>
       <w:r>
-        <w:rPr>
-          <w:rFonts w:ascii="Times New Roman" w:hAnsi="Times New Roman"/>
-          <w:sz w:val="21"/>
-        </w:rPr>
-        <w:t>For D1, demonstrate the working PDF increment and ask the supervisor to confirm its scope against the original billing proposal. Do not present output Accepted as payer acceptance, OCR confidence as accuracy, or cloud extraction as a trained denial-risk model.</w:t>
+        <w:t>Demonstrate the complete D1 claim-intake slice and request supervisor confirmation that this is the correct first increment. The next work should add official claim export or submission requirements, eligibility and code lookup, payments and denials, reconciled financial reports, and a properly evaluated denial-risk model.</w:t>
       </w:r>
     </w:p>
     <w:sectPr>

</xml_diff>

<commit_message>
docs(d1): align repository workflow and submission
</commit_message>
<xml_diff>
--- a/D1-FINAL/01_Submission/MedBill_D1_Report.docx
+++ b/D1-FINAL/01_Submission/MedBill_D1_Report.docx
@@ -1491,7 +1491,7 @@
                 <w:rStyle w:val="Hyperlink"/>
                 <w:noProof/>
               </w:rPr>
-              <w:t>2. System Design High Level</w:t>
+              <w:t>2. System Design (High-Level)</w:t>
             </w:r>
             <w:r>
               <w:rPr>
@@ -1559,7 +1559,7 @@
                 <w:rStyle w:val="Hyperlink"/>
                 <w:noProof/>
               </w:rPr>
-              <w:t>3. Features and Scope</w:t>
+              <w:t>3. Features &amp; Scope</w:t>
             </w:r>
             <w:r>
               <w:rPr>
@@ -1831,7 +1831,7 @@
                 <w:rStyle w:val="Hyperlink"/>
                 <w:noProof/>
               </w:rPr>
-              <w:t>7. Definition of Done</w:t>
+              <w:t>7. Definition of Done (DoD)</w:t>
             </w:r>
             <w:r>
               <w:rPr>
@@ -1872,7 +1872,7 @@
                 <w:noProof/>
                 <w:webHidden/>
               </w:rPr>
-              <w:t>7</w:t>
+              <w:t>8</w:t>
             </w:r>
             <w:r>
               <w:rPr>
@@ -1940,7 +1940,7 @@
                 <w:noProof/>
                 <w:webHidden/>
               </w:rPr>
-              <w:t>8</w:t>
+              <w:t>9</w:t>
             </w:r>
             <w:r>
               <w:rPr>
@@ -1967,7 +1967,7 @@
                 <w:rStyle w:val="Hyperlink"/>
                 <w:noProof/>
               </w:rPr>
-              <w:t>9. CI CD Plan Brief</w:t>
+              <w:t>9. CI/CD Plan (Brief)</w:t>
             </w:r>
             <w:r>
               <w:rPr>
@@ -2008,7 +2008,7 @@
                 <w:noProof/>
                 <w:webHidden/>
               </w:rPr>
-              <w:t>8</w:t>
+              <w:t>9</w:t>
             </w:r>
             <w:r>
               <w:rPr>
@@ -2035,7 +2035,7 @@
                 <w:rStyle w:val="Hyperlink"/>
                 <w:noProof/>
               </w:rPr>
-              <w:t>10. Next Steps Semester 8</w:t>
+              <w:t>10. Next Steps (Semester 8)</w:t>
             </w:r>
             <w:r>
               <w:rPr>
@@ -2076,7 +2076,7 @@
                 <w:noProof/>
                 <w:webHidden/>
               </w:rPr>
-              <w:t>9</w:t>
+              <w:t>10</w:t>
             </w:r>
             <w:r>
               <w:rPr>
@@ -2166,7 +2166,10 @@
         <w:spacing w:after="100" w:line="269" w:lineRule="auto"/>
       </w:pPr>
       <w:r>
-        <w:t>MedBill is a medical billing project for small clinics and billing teams. Our D1 increment implements the first usable claim-intake slice: a biller signs in, creates a claim manually or from a PDF, reviews the patient, insurance and service fields, runs explainable checks, saves the validated draft and opens a CMS-1500-style preview.</w:t>
+        <w:rPr>
+          <w:rFonts w:ascii="Times New Roman" w:hAnsi="Times New Roman"/>
+        </w:rPr>
+        <w:t>Product vision. MedBill will give small clinics and billing teams one system for preparing, checking, tracking and reporting medical billing work. The D1 increment implements the first usable claim-intake workflow: a biller signs in, creates a claim manually or from a PDF, reviews the patient, insurance and service details, runs validation, saves the draft and opens a CMS-1500-style preview.</w:t>
       </w:r>
     </w:p>
     <w:p>
@@ -2174,7 +2177,10 @@
         <w:spacing w:after="100" w:line="269" w:lineRule="auto"/>
       </w:pPr>
       <w:r>
-        <w:t>Problem. Claim information arrives in different forms, and manual re-entry can miss patient identifiers, insurance details, dates, diagnosis codes, procedure codes and charges. D1 needs one inspectable path that turns this information into a structured draft without claiming that the whole billing lifecycle is complete.</w:t>
+        <w:rPr>
+          <w:rFonts w:ascii="Times New Roman" w:hAnsi="Times New Roman"/>
+        </w:rPr>
+        <w:t>Problem. Claim details arrive in different formats, and manual re-entry can omit patient identifiers, insurance information, dates, codes or charges. D1 focuses on converting those details into a structured draft that the biller reviews before saving.</w:t>
       </w:r>
     </w:p>
     <w:p>
@@ -2182,7 +2188,10 @@
         <w:spacing w:after="100" w:line="269" w:lineRule="auto"/>
       </w:pPr>
       <w:r>
-        <w:t>Target users. A biller creates and reviews synthetic draft claims. An admin can also open the preserved technical PDF workspace. Signed sessions and role checks protect the claim and document APIs. The public demonstration must still use synthetic data only.</w:t>
+        <w:rPr>
+          <w:rFonts w:ascii="Times New Roman" w:hAnsi="Times New Roman"/>
+        </w:rPr>
+        <w:t>Target users. MedBill is intended for small clinics and billing teams. The D1 workflow is demonstrated from the Biller role, while role-based sign-in also distinguishes the Admin role defined in the proposal. The public demonstration uses synthetic data only.</w:t>
       </w:r>
     </w:p>
     <w:p>
@@ -2190,7 +2199,10 @@
         <w:spacing w:after="100" w:line="269" w:lineRule="auto"/>
       </w:pPr>
       <w:r>
-        <w:t>D1 solution. Both input paths lead to the same editable claim, deterministic validation result, PostgreSQL record and printable CMS-1500-style preview. A validated draft means the required D1 format and presence checks passed; it does not mean a payer accepted the claim.</w:t>
+        <w:rPr>
+          <w:rFonts w:ascii="Times New Roman" w:hAnsi="Times New Roman"/>
+        </w:rPr>
+        <w:t>D1 solution. Manual entry and PDF upload lead to the same editable claim, validation result, PostgreSQL record and printable CMS-1500-style preview. In this report, validated means that the D1 presence and format checks passed; it does not mean that a payer accepted the claim.</w:t>
       </w:r>
     </w:p>
     <w:p>
@@ -2207,7 +2219,7 @@
           <w:color w:val="1F4E79"/>
           <w:sz w:val="26"/>
         </w:rPr>
-        <w:t>2. System Design High Level</w:t>
+        <w:t>2. System Design (High-Level)</w:t>
       </w:r>
     </w:p>
     <w:p>
@@ -2215,7 +2227,7 @@
         <w:spacing w:after="100" w:line="269" w:lineRule="auto"/>
       </w:pPr>
       <w:r>
-        <w:t>One Next.js application serves the React interface and Node.js Route Handlers on Vercel. Signed demo sessions enforce Biller and Admin roles. Prisma stores patients, insurance records, claims and source-document metadata in Supabase PostgreSQL. Cloudflare R2 stores private PDFs. PDF.js reads embedded text and Tesseract.js handles scanned pages before the biller reviews every extracted value.</w:t>
+        <w:t>MedBill is a web application deployed on Vercel. The Next.js interface calls Node.js Route Handlers for authentication, PDF extraction, validation and claim persistence. Prisma stores patient, insurance, claim and source-document metadata in Supabase PostgreSQL. Cloudflare R2 stores private PDFs. PDF.js reads embedded text, and Tesseract.js handles scanned pages before the biller reviews the extracted values.</w:t>
       </w:r>
     </w:p>
     <w:tbl>
@@ -2332,7 +2344,7 @@
           </w:tcPr>
           <w:p>
             <w:r>
-              <w:t>Signed sessions, extraction, validation, claim persistence, protected technical APIs</w:t>
+              <w:t>Signed sessions, extraction, validation and claim persistence</w:t>
             </w:r>
           </w:p>
         </w:tc>
@@ -2379,7 +2391,7 @@
         <w:spacing w:after="40" w:line="252" w:lineRule="auto"/>
       </w:pPr>
       <w:r>
-        <w:t>Backend: Next.js Node.js Route Handlers for authentication, claim listing and creation, PDF extraction and the admin technical workspace.</w:t>
+        <w:t>Backend: Next.js Node.js Route Handlers for authentication, claim listing and creation, PDF extraction and validation.</w:t>
       </w:r>
     </w:p>
     <w:p>
@@ -2423,7 +2435,7 @@
           <w:color w:val="1F4E79"/>
           <w:sz w:val="26"/>
         </w:rPr>
-        <w:t>3. Features and Scope</w:t>
+        <w:t>3. Features &amp; Scope</w:t>
       </w:r>
     </w:p>
     <w:p>
@@ -2432,7 +2444,10 @@
         <w:spacing w:before="140" w:after="60"/>
       </w:pPr>
       <w:r>
-        <w:t>Core D1 capabilities</w:t>
+        <w:rPr>
+          <w:rFonts w:ascii="Times New Roman" w:hAnsi="Times New Roman"/>
+        </w:rPr>
+        <w:t>Core Features (Epics)</w:t>
       </w:r>
     </w:p>
     <w:p>
@@ -2441,6 +2456,16 @@
         <w:spacing w:after="40" w:line="252" w:lineRule="auto"/>
       </w:pPr>
       <w:r>
+        <w:rPr>
+          <w:rFonts w:ascii="Times New Roman" w:hAnsi="Times New Roman"/>
+          <w:b/>
+        </w:rPr>
+        <w:t xml:space="preserve">Access and roles: </w:t>
+      </w:r>
+      <w:r>
+        <w:rPr>
+          <w:rFonts w:ascii="Times New Roman" w:hAnsi="Times New Roman"/>
+        </w:rPr>
         <w:t>Biller and Admin demo sign-in with an eight-hour signed session</w:t>
       </w:r>
     </w:p>
@@ -2450,7 +2475,17 @@
         <w:spacing w:after="40" w:line="252" w:lineRule="auto"/>
       </w:pPr>
       <w:r>
-        <w:t>Manual patient, insurance and single-service claim entry</w:t>
+        <w:rPr>
+          <w:rFonts w:ascii="Times New Roman" w:hAnsi="Times New Roman"/>
+          <w:b/>
+        </w:rPr>
+        <w:t xml:space="preserve">Manual claim intake: </w:t>
+      </w:r>
+      <w:r>
+        <w:rPr>
+          <w:rFonts w:ascii="Times New Roman" w:hAnsi="Times New Roman"/>
+        </w:rPr>
+        <w:t>patient, insurance and single-service entry</w:t>
       </w:r>
     </w:p>
     <w:p>
@@ -2459,6 +2494,16 @@
         <w:spacing w:after="40" w:line="252" w:lineRule="auto"/>
       </w:pPr>
       <w:r>
+        <w:rPr>
+          <w:rFonts w:ascii="Times New Roman" w:hAnsi="Times New Roman"/>
+          <w:b/>
+        </w:rPr>
+        <w:t xml:space="preserve">Document intake: </w:t>
+      </w:r>
+      <w:r>
+        <w:rPr>
+          <w:rFonts w:ascii="Times New Roman" w:hAnsi="Times New Roman"/>
+        </w:rPr>
         <w:t>PDF upload with embedded-text extraction or local OCR</w:t>
       </w:r>
     </w:p>
@@ -2468,7 +2513,17 @@
         <w:spacing w:after="40" w:line="252" w:lineRule="auto"/>
       </w:pPr>
       <w:r>
-        <w:t>Human review and correction before validation</w:t>
+        <w:rPr>
+          <w:rFonts w:ascii="Times New Roman" w:hAnsi="Times New Roman"/>
+          <w:b/>
+        </w:rPr>
+        <w:t xml:space="preserve">Human review: </w:t>
+      </w:r>
+      <w:r>
+        <w:rPr>
+          <w:rFonts w:ascii="Times New Roman" w:hAnsi="Times New Roman"/>
+        </w:rPr>
+        <w:t>correction of extracted or entered values before validation</w:t>
       </w:r>
     </w:p>
     <w:p>
@@ -2477,7 +2532,17 @@
         <w:spacing w:after="40" w:line="252" w:lineRule="auto"/>
       </w:pPr>
       <w:r>
-        <w:t>Explainable required-field, code-format, date and amount checks</w:t>
+        <w:rPr>
+          <w:rFonts w:ascii="Times New Roman" w:hAnsi="Times New Roman"/>
+          <w:b/>
+        </w:rPr>
+        <w:t xml:space="preserve">Claim validation: </w:t>
+      </w:r>
+      <w:r>
+        <w:rPr>
+          <w:rFonts w:ascii="Times New Roman" w:hAnsi="Times New Roman"/>
+        </w:rPr>
+        <w:t>explainable required-field, code-format, date and amount checks</w:t>
       </w:r>
     </w:p>
     <w:p>
@@ -2486,7 +2551,17 @@
         <w:spacing w:after="40" w:line="252" w:lineRule="auto"/>
       </w:pPr>
       <w:r>
-        <w:t>PostgreSQL claim persistence and recent-claim history</w:t>
+        <w:rPr>
+          <w:rFonts w:ascii="Times New Roman" w:hAnsi="Times New Roman"/>
+          <w:b/>
+        </w:rPr>
+        <w:t xml:space="preserve">Persistence and history: </w:t>
+      </w:r>
+      <w:r>
+        <w:rPr>
+          <w:rFonts w:ascii="Times New Roman" w:hAnsi="Times New Roman"/>
+        </w:rPr>
+        <w:t>PostgreSQL claim storage and recent-claim history</w:t>
       </w:r>
     </w:p>
     <w:p>
@@ -2495,6 +2570,16 @@
         <w:spacing w:after="40" w:line="252" w:lineRule="auto"/>
       </w:pPr>
       <w:r>
+        <w:rPr>
+          <w:rFonts w:ascii="Times New Roman" w:hAnsi="Times New Roman"/>
+          <w:b/>
+        </w:rPr>
+        <w:t xml:space="preserve">Claim preview: </w:t>
+      </w:r>
+      <w:r>
+        <w:rPr>
+          <w:rFonts w:ascii="Times New Roman" w:hAnsi="Times New Roman"/>
+        </w:rPr>
         <w:t>CMS-1500-style preview with browser print or Save as PDF</w:t>
       </w:r>
     </w:p>
@@ -2604,7 +2689,7 @@
           </w:tcPr>
           <w:p>
             <w:r>
-              <w:t>Biller and Admin demo roles</w:t>
+              <w:t>Role-based demo sign-in</w:t>
             </w:r>
           </w:p>
         </w:tc>
@@ -2621,7 +2706,7 @@
           </w:tcPr>
           <w:p>
             <w:r>
-              <w:t>Demo accounts, not production identity management</w:t>
+              <w:t>Demo accounts; no production identity or user administration</w:t>
             </w:r>
           </w:p>
         </w:tc>
@@ -2891,7 +2976,7 @@
           </w:tcPr>
           <w:p>
             <w:r>
-              <w:t>Recent claims and technical evidence</w:t>
+              <w:t>Recent-claim history</w:t>
             </w:r>
           </w:p>
         </w:tc>
@@ -2909,7 +2994,7 @@
           </w:tcPr>
           <w:p>
             <w:r>
-              <w:t>No payment or denial lifecycle</w:t>
+              <w:t>No payment, denial or reporting lifecycle</w:t>
             </w:r>
           </w:p>
         </w:tc>
@@ -2927,7 +3012,7 @@
           </w:tcPr>
           <w:p>
             <w:r>
-              <w:t>Payments, denials, financial reports and measured ML</w:t>
+              <w:t>Payments, denials, financial reports and measured machine learning</w:t>
             </w:r>
           </w:p>
         </w:tc>
@@ -2938,7 +3023,10 @@
         <w:spacing w:after="100" w:line="269" w:lineRule="auto"/>
       </w:pPr>
       <w:r>
-        <w:t>This increment does not submit claims to payers, verify eligibility, post payments, manage denials, reconcile finances or claim that a trained denial-risk model exists. The older AI document router remains available only to the Admin as technical evidence and is not the supervisor-facing D1 product flow.</w:t>
+        <w:rPr>
+          <w:rFonts w:ascii="Times New Roman" w:hAnsi="Times New Roman"/>
+        </w:rPr>
+        <w:t>D1 does not submit claims to payers, verify eligibility, post payments, manage denials or reconcile finances. It also does not include a trained denial-risk model. These functions remain in the product backlog for later increments.</w:t>
       </w:r>
     </w:p>
     <w:p>
@@ -2963,7 +3051,10 @@
         <w:spacing w:after="100" w:line="269" w:lineRule="auto"/>
       </w:pPr>
       <w:r>
-        <w:t>The Must stories below define the demonstrated claim-intake increment. Done refers only to the stated acceptance check. Later billing, integration and measured machine-learning work remains in the backlog.</w:t>
+        <w:rPr>
+          <w:rFonts w:ascii="Times New Roman" w:hAnsi="Times New Roman"/>
+        </w:rPr>
+        <w:t>The backlog uses MoSCoW priorities. Must stories form the demonstrated D1 increment; Should and Could stories remain planned. A story is marked Done only when its stated acceptance criterion passes.</w:t>
       </w:r>
     </w:p>
     <w:tbl>
@@ -3060,7 +3151,7 @@
               <w:rPr>
                 <w:sz w:val="15"/>
               </w:rPr>
-              <w:t>User story and acceptance check</w:t>
+              <w:t>User story and acceptance criterion</w:t>
             </w:r>
           </w:p>
         </w:tc>
@@ -3158,7 +3249,7 @@
               <w:rPr>
                 <w:sz w:val="15"/>
               </w:rPr>
-              <w:t>As a biller or admin, I sign in and protected pages/APIs refuse unauthenticated access.</w:t>
+              <w:t>Story: As a biller or admin, I want secure sign-in so that protected functions are not publicly accessible. Acceptance: valid credentials create a signed session; invalid credentials and unauthenticated requests are rejected.</w:t>
             </w:r>
           </w:p>
         </w:tc>
@@ -3258,7 +3349,7 @@
               <w:rPr>
                 <w:sz w:val="15"/>
               </w:rPr>
-              <w:t>As a biller, I enter the minimum patient and insurance fields needed for a draft claim.</w:t>
+              <w:t>Story: As a biller, I want to enter patient and insurance details so that a claim has the required member information. Acceptance: missing required fields prevent saving.</w:t>
             </w:r>
           </w:p>
         </w:tc>
@@ -3356,7 +3447,7 @@
               <w:rPr>
                 <w:sz w:val="15"/>
               </w:rPr>
-              <w:t>As a biller, I enter provider, service, diagnosis, procedure and charge information.</w:t>
+              <w:t>Story: As a biller, I want to enter provider, service, diagnosis, procedure and charge details so that I can prepare a draft claim. Acceptance: one complete service line passes the D1 format checks.</w:t>
             </w:r>
           </w:p>
         </w:tc>
@@ -3456,7 +3547,7 @@
               <w:rPr>
                 <w:sz w:val="15"/>
               </w:rPr>
-              <w:t>As a biller, I upload a valid PDF and receive editable extracted fields; invalid files are refused.</w:t>
+              <w:t>Story: As a biller, I want to upload a PDF so that available claim details populate an editable form. Acceptance: valid PDFs produce editable fields and invalid files are rejected.</w:t>
             </w:r>
           </w:p>
         </w:tc>
@@ -3554,7 +3645,7 @@
               <w:rPr>
                 <w:sz w:val="15"/>
               </w:rPr>
-              <w:t>As a biller, I review and correct all manual or extracted values before validation.</w:t>
+              <w:t>Story: As a biller, I want to review and correct entered or extracted values so that I control the saved claim data. Acceptance: the form remains editable before validation and saving.</w:t>
             </w:r>
           </w:p>
         </w:tc>
@@ -3654,7 +3745,7 @@
               <w:rPr>
                 <w:sz w:val="15"/>
               </w:rPr>
-              <w:t>As a biller, I see explainable checks and cannot save while required checks fail.</w:t>
+              <w:t>Story: As a biller, I want clear validation messages so that I can correct missing or malformed data. Acceptance: failed checks are shown and saving remains blocked until required checks pass.</w:t>
             </w:r>
           </w:p>
         </w:tc>
@@ -3752,7 +3843,7 @@
               <w:rPr>
                 <w:sz w:val="15"/>
               </w:rPr>
-              <w:t>As a biller, I save a validated draft and find it in recent claim history.</w:t>
+              <w:t>Story: As a biller, I want to save a validated draft so that I can find it in recent-claim history. Acceptance: the saved claim persists in PostgreSQL and appears in history.</w:t>
             </w:r>
           </w:p>
         </w:tc>
@@ -3852,7 +3943,7 @@
               <w:rPr>
                 <w:sz w:val="15"/>
               </w:rPr>
-              <w:t>As a biller, I open a CMS-1500-style preview and print or save it as PDF.</w:t>
+              <w:t>Story: As a biller, I want a CMS-1500-style preview so that I can review and print the draft. Acceptance: a saved claim opens a populated preview that can be printed or saved as PDF.</w:t>
             </w:r>
           </w:p>
         </w:tc>
@@ -3904,7 +3995,7 @@
               <w:rPr>
                 <w:sz w:val="15"/>
               </w:rPr>
-              <w:t>TECH-01</w:t>
+              <w:t>USR-01</w:t>
             </w:r>
           </w:p>
         </w:tc>
@@ -3950,7 +4041,7 @@
               <w:rPr>
                 <w:sz w:val="15"/>
               </w:rPr>
-              <w:t>As an admin, I can open the older technical PDF workspace without exposing it to billers.</w:t>
+              <w:t>Story: As an admin, I want to manage users and reference data so that access and shared billing values remain controlled. Acceptance: authorized admins can create, update and deactivate records.</w:t>
             </w:r>
           </w:p>
         </w:tc>
@@ -3973,7 +4064,7 @@
               <w:rPr>
                 <w:sz w:val="15"/>
               </w:rPr>
-              <w:t>Done</w:t>
+              <w:t>Planned</w:t>
             </w:r>
           </w:p>
         </w:tc>
@@ -4026,7 +4117,7 @@
               <w:rPr>
                 <w:sz w:val="15"/>
               </w:rPr>
-              <w:t>Later</w:t>
+              <w:t>Could</w:t>
             </w:r>
           </w:p>
         </w:tc>
@@ -4050,7 +4141,7 @@
               <w:rPr>
                 <w:sz w:val="15"/>
               </w:rPr>
-              <w:t>As a biller, I post payments, adjustments and denial outcomes.</w:t>
+              <w:t>Story: As a biller, I want to record payments, adjustments and denials so that claim balances and outcomes remain current. Acceptance: posted transactions update the claim balance and status.</w:t>
             </w:r>
           </w:p>
         </w:tc>
@@ -4079,6 +4170,208 @@
           </w:p>
         </w:tc>
       </w:tr>
+      <w:tr>
+        <w:trPr>
+          <w:cantSplit/>
+        </w:trPr>
+        <w:tc>
+          <w:tcPr>
+            <w:tcW w:type="dxa" w:w="1152"/>
+            <w:vAlign w:val="center"/>
+            <w:tcMar>
+              <w:top w:w="90" w:type="dxa"/>
+              <w:start w:w="120" w:type="dxa"/>
+              <w:bottom w:w="90" w:type="dxa"/>
+              <w:end w:w="120" w:type="dxa"/>
+            </w:tcMar>
+            <w:shd w:fill="EEF4F8"/>
+          </w:tcPr>
+          <w:p>
+            <w:pPr>
+              <w:spacing w:after="0"/>
+            </w:pPr>
+            <w:r>
+              <w:rPr>
+                <w:sz w:val="15"/>
+              </w:rPr>
+              <w:t>RPT-01</w:t>
+            </w:r>
+          </w:p>
+        </w:tc>
+        <w:tc>
+          <w:tcPr>
+            <w:tcW w:type="dxa" w:w="1008"/>
+            <w:vAlign w:val="center"/>
+            <w:tcMar>
+              <w:top w:w="90" w:type="dxa"/>
+              <w:start w:w="120" w:type="dxa"/>
+              <w:bottom w:w="90" w:type="dxa"/>
+              <w:end w:w="120" w:type="dxa"/>
+            </w:tcMar>
+            <w:shd w:fill="EEF4F8"/>
+          </w:tcPr>
+          <w:p>
+            <w:pPr>
+              <w:spacing w:after="0"/>
+            </w:pPr>
+            <w:r>
+              <w:rPr>
+                <w:sz w:val="15"/>
+              </w:rPr>
+              <w:t>Could</w:t>
+            </w:r>
+          </w:p>
+        </w:tc>
+        <w:tc>
+          <w:tcPr>
+            <w:tcW w:type="dxa" w:w="5544"/>
+            <w:vAlign w:val="center"/>
+            <w:tcMar>
+              <w:top w:w="90" w:type="dxa"/>
+              <w:start w:w="120" w:type="dxa"/>
+              <w:bottom w:w="90" w:type="dxa"/>
+              <w:end w:w="120" w:type="dxa"/>
+            </w:tcMar>
+            <w:shd w:fill="EEF4F8"/>
+          </w:tcPr>
+          <w:p>
+            <w:pPr>
+              <w:spacing w:after="0"/>
+            </w:pPr>
+            <w:r>
+              <w:rPr>
+                <w:sz w:val="15"/>
+              </w:rPr>
+              <w:t>Story: As a billing lead, I want revenue, aging and denial reports so that I can monitor outstanding and collected amounts. Acceptance: report totals reconcile with stored claims and payments.</w:t>
+            </w:r>
+          </w:p>
+        </w:tc>
+        <w:tc>
+          <w:tcPr>
+            <w:tcW w:type="dxa" w:w="1296"/>
+            <w:vAlign w:val="center"/>
+            <w:tcMar>
+              <w:top w:w="90" w:type="dxa"/>
+              <w:start w:w="120" w:type="dxa"/>
+              <w:bottom w:w="90" w:type="dxa"/>
+              <w:end w:w="120" w:type="dxa"/>
+            </w:tcMar>
+            <w:shd w:fill="EEF4F8"/>
+          </w:tcPr>
+          <w:p>
+            <w:pPr>
+              <w:spacing w:after="0"/>
+            </w:pPr>
+            <w:r>
+              <w:rPr>
+                <w:sz w:val="15"/>
+              </w:rPr>
+              <w:t>Planned</w:t>
+            </w:r>
+          </w:p>
+        </w:tc>
+      </w:tr>
+      <w:tr>
+        <w:trPr>
+          <w:cantSplit/>
+        </w:trPr>
+        <w:tc>
+          <w:tcPr>
+            <w:tcW w:type="dxa" w:w="1152"/>
+            <w:vAlign w:val="center"/>
+            <w:tcMar>
+              <w:top w:w="90" w:type="dxa"/>
+              <w:start w:w="120" w:type="dxa"/>
+              <w:bottom w:w="90" w:type="dxa"/>
+              <w:end w:w="120" w:type="dxa"/>
+            </w:tcMar>
+            <w:shd w:fill="EEF4F8"/>
+          </w:tcPr>
+          <w:p>
+            <w:pPr>
+              <w:spacing w:after="0"/>
+            </w:pPr>
+            <w:r>
+              <w:rPr>
+                <w:sz w:val="15"/>
+              </w:rPr>
+              <w:t>AI-01</w:t>
+            </w:r>
+          </w:p>
+        </w:tc>
+        <w:tc>
+          <w:tcPr>
+            <w:tcW w:type="dxa" w:w="1008"/>
+            <w:vAlign w:val="center"/>
+            <w:tcMar>
+              <w:top w:w="90" w:type="dxa"/>
+              <w:start w:w="120" w:type="dxa"/>
+              <w:bottom w:w="90" w:type="dxa"/>
+              <w:end w:w="120" w:type="dxa"/>
+            </w:tcMar>
+            <w:shd w:fill="EEF4F8"/>
+          </w:tcPr>
+          <w:p>
+            <w:pPr>
+              <w:spacing w:after="0"/>
+            </w:pPr>
+            <w:r>
+              <w:rPr>
+                <w:sz w:val="15"/>
+              </w:rPr>
+              <w:t>Could</w:t>
+            </w:r>
+          </w:p>
+        </w:tc>
+        <w:tc>
+          <w:tcPr>
+            <w:tcW w:type="dxa" w:w="5544"/>
+            <w:vAlign w:val="center"/>
+            <w:tcMar>
+              <w:top w:w="90" w:type="dxa"/>
+              <w:start w:w="120" w:type="dxa"/>
+              <w:bottom w:w="90" w:type="dxa"/>
+              <w:end w:w="120" w:type="dxa"/>
+            </w:tcMar>
+            <w:shd w:fill="EEF4F8"/>
+          </w:tcPr>
+          <w:p>
+            <w:pPr>
+              <w:spacing w:after="0"/>
+            </w:pPr>
+            <w:r>
+              <w:rPr>
+                <w:sz w:val="15"/>
+              </w:rPr>
+              <w:t>Story: As a biller, I want measured denial-risk warnings so that I can review higher-risk claims before submission. Acceptance: the approved model reports documented evaluation results and explainable warnings.</w:t>
+            </w:r>
+          </w:p>
+        </w:tc>
+        <w:tc>
+          <w:tcPr>
+            <w:tcW w:type="dxa" w:w="1296"/>
+            <w:vAlign w:val="center"/>
+            <w:tcMar>
+              <w:top w:w="90" w:type="dxa"/>
+              <w:start w:w="120" w:type="dxa"/>
+              <w:bottom w:w="90" w:type="dxa"/>
+              <w:end w:w="120" w:type="dxa"/>
+            </w:tcMar>
+            <w:shd w:fill="EEF4F8"/>
+          </w:tcPr>
+          <w:p>
+            <w:pPr>
+              <w:spacing w:after="0"/>
+            </w:pPr>
+            <w:r>
+              <w:rPr>
+                <w:sz w:val="15"/>
+              </w:rPr>
+              <w:t>Planned</w:t>
+            </w:r>
+          </w:p>
+        </w:tc>
+      </w:tr>
     </w:tbl>
     <w:p>
       <w:pPr>
@@ -4102,7 +4395,10 @@
         <w:spacing w:after="100" w:line="269" w:lineRule="auto"/>
       </w:pPr>
       <w:r>
-        <w:t>Open https://medbill-steel.vercel.app and sign in with the Biller demo account. First show manual entry: use synthetic patient and insurance data, enter one service line, review it, validate it and open the CMS-1500-style preview. Then upload the supplied synthetic claim PDF, confirm that the same editable form is populated, correct any extraction error and complete the same validation and preview path. Use the Admin role only if the supervisor asks to see the preserved technical workspace.</w:t>
+        <w:rPr>
+          <w:rFonts w:ascii="Times New Roman" w:hAnsi="Times New Roman"/>
+        </w:rPr>
+        <w:t>The deployed prototype is available at https://medbill-steel.vercel.app. The demonstration signs in with the Biller demo account and follows two paths. First, the biller enters synthetic patient, insurance and service data, reviews it, validates it and opens the CMS-1500-style preview. Second, the biller uploads the supplied synthetic claim PDF, reviews and corrects the extracted fields, then repeats the validation and preview steps.</w:t>
       </w:r>
     </w:p>
     <w:p>
@@ -4160,7 +4456,7 @@
         <w:spacing w:before="140" w:after="60"/>
       </w:pPr>
       <w:r>
-        <w:t>Current limitations</w:t>
+        <w:t>Prototype status</w:t>
       </w:r>
     </w:p>
     <w:p>
@@ -4169,7 +4465,7 @@
         <w:spacing w:after="40" w:line="252" w:lineRule="auto"/>
       </w:pPr>
       <w:r>
-        <w:t>The public deployment is for synthetic data only. It has a 4 MB PDF upload limit and an eight-hour demo session.</w:t>
+        <w:t>Implemented: role-based demo sign-in, manual and PDF claim intake, human review, validation, PostgreSQL persistence, recent-claim history and a printable CMS-1500-style preview.</w:t>
       </w:r>
     </w:p>
     <w:p>
@@ -4178,7 +4474,7 @@
         <w:spacing w:after="40" w:line="252" w:lineRule="auto"/>
       </w:pPr>
       <w:r>
-        <w:t>D1 checks validate required fields and recognizable formats. They do not verify insurer eligibility, medical necessity, official code-set status or reimbursement.</w:t>
+        <w:t>Partially implemented: PDF extraction is label-based and scanned pages use OCR, so the biller must review the result. Validation checks required fields and recognizable formats but does not apply official payer or eligibility rules.</w:t>
       </w:r>
     </w:p>
     <w:p>
@@ -4187,7 +4483,7 @@
         <w:spacing w:after="40" w:line="252" w:lineRule="auto"/>
       </w:pPr>
       <w:r>
-        <w:t>The CMS-1500-style screen is a printable preview, not an official electronic claim submission. Payment posting, denials, financial reports and a measured denial-risk model remain later work.</w:t>
+        <w:t>Not implemented: electronic payer submission, eligibility verification, payment posting, denial management, financial reports and a trained, measured denial-risk model.</w:t>
       </w:r>
     </w:p>
     <w:p>
@@ -4212,7 +4508,7 @@
         <w:spacing w:after="100" w:line="269" w:lineRule="auto"/>
       </w:pPr>
       <w:r>
-        <w:t>Live app: https://medbill-steel.vercel.app. GitHub: https://github.com/hasanabdullah919/medbill_bsef23-51. D1 runtime source: commit 4350ab2. Vercel production deployment: dpl_99N9vS92hSvGEXg2S7noCZ8e1LC5. Production verification was completed on 14 October 2026.</w:t>
+        <w:t>Live app: https://medbill-steel.vercel.app. GitHub repository: https://github.com/hasanabdullah919/medbill_bsef23-51. The deployed D1 source is recorded at commit 4350ab2. Production verification was completed on 14 October 2026.</w:t>
       </w:r>
     </w:p>
     <w:tbl>
@@ -4461,7 +4757,7 @@
           </w:tcPr>
           <w:p>
             <w:r>
-              <w:t>Authentication, manual flow, PDF flow, invalid login and admin access</w:t>
+              <w:t>Authentication, manual entry, PDF extraction, validation, persistence and preview passed</w:t>
             </w:r>
           </w:p>
         </w:tc>
@@ -4599,7 +4895,7 @@
           </w:tcPr>
           <w:p>
             <w:r>
-              <w:t>Unauthenticated document API</w:t>
+              <w:t>Protected API access</w:t>
             </w:r>
           </w:p>
         </w:tc>
@@ -4635,7 +4931,7 @@
           </w:tcPr>
           <w:p>
             <w:r>
-              <w:t>Older PDF data is no longer publicly accessible</w:t>
+              <w:t>Requests without a valid session are rejected</w:t>
             </w:r>
           </w:p>
         </w:tc>
@@ -4646,14 +4942,23 @@
         <w:spacing w:after="100" w:line="269" w:lineRule="auto"/>
       </w:pPr>
       <w:r>
-        <w:t>The evidence folder includes the live D1 workspace screenshot and the production test record. Synthetic PDFs support the extraction demonstration. The repository contains the active source, Prisma migration and browser tests without credentials, dependencies or generated build output.</w:t>
+        <w:rPr>
+          <w:rFonts w:ascii="Times New Roman" w:hAnsi="Times New Roman"/>
+          <w:b/>
+        </w:rPr>
+        <w:t>Sprint summary. During this sprint, we refined the backlog, implemented the claim-intake increment, tested it locally and in production, and deployed it. AUTH-01 through CMS-01 are Done. User administration, payments, reporting, payer integrations, measured machine-learning work and hosted CI remain Planned. OCR variability and private document storage were handled through mandatory human review, protected R2 storage and bundled runtime assets.</w:t>
+      </w:r>
+      <w:r>
+        <w:rPr>
+          <w:rFonts w:ascii="Times New Roman" w:hAnsi="Times New Roman"/>
+        </w:rPr>
       </w:r>
     </w:p>
     <w:p>
       <w:pPr>
         <w:pStyle w:val="Heading1"/>
         <w:keepNext/>
-        <w:pageBreakBefore w:val="0"/>
+        <w:pageBreakBefore/>
         <w:spacing w:before="200" w:after="100"/>
       </w:pPr>
       <w:r>
@@ -4663,15 +4968,120 @@
           <w:color w:val="1F4E79"/>
           <w:sz w:val="26"/>
         </w:rPr>
-        <w:t>7. Definition of Done</w:t>
+        <w:t>7. Definition of Done (DoD)</w:t>
       </w:r>
     </w:p>
     <w:p>
       <w:pPr>
+        <w:keepNext/>
+        <w:pageBreakBefore w:val="0"/>
+        <w:spacing w:before="200" w:after="100"/>
+      </w:pPr>
+      <w:r>
+        <w:rPr>
+          <w:b/>
+          <w:color w:val="000000"/>
+        </w:rPr>
+        <w:t>Definition of Ready</w:t>
+      </w:r>
+    </w:p>
+    <w:p>
+      <w:pPr>
+        <w:keepNext w:val="0"/>
+        <w:pageBreakBefore w:val="0"/>
+        <w:spacing w:before="200" w:after="100"/>
+      </w:pPr>
+      <w:r>
+        <w:rPr>
+          <w:b w:val="0"/>
+          <w:color w:val="000000"/>
+        </w:rPr>
+        <w:t>A story is Ready for a sprint when the team can implement and verify it without unresolved scope or access questions.</w:t>
+      </w:r>
+    </w:p>
+    <w:p>
+      <w:pPr>
+        <w:pStyle w:val="ListBullet"/>
+        <w:keepNext w:val="0"/>
+        <w:pageBreakBefore w:val="0"/>
+        <w:spacing w:before="200" w:after="100"/>
+      </w:pPr>
+      <w:r>
+        <w:rPr>
+          <w:b w:val="0"/>
+          <w:color w:val="000000"/>
+        </w:rPr>
+        <w:t>The story identifies the user, need and benefit and has a MoSCoW priority.</w:t>
+      </w:r>
+    </w:p>
+    <w:p>
+      <w:pPr>
+        <w:pStyle w:val="ListBullet"/>
+        <w:keepNext w:val="0"/>
+        <w:pageBreakBefore w:val="0"/>
+        <w:spacing w:before="200" w:after="100"/>
+      </w:pPr>
+      <w:r>
+        <w:rPr>
+          <w:b w:val="0"/>
+          <w:color w:val="000000"/>
+        </w:rPr>
+        <w:t>The acceptance criterion is specific and testable.</w:t>
+      </w:r>
+    </w:p>
+    <w:p>
+      <w:pPr>
+        <w:pStyle w:val="ListBullet"/>
+        <w:keepNext w:val="0"/>
+        <w:pageBreakBefore w:val="0"/>
+        <w:spacing w:before="200" w:after="100"/>
+      </w:pPr>
+      <w:r>
+        <w:rPr>
+          <w:b w:val="0"/>
+          <w:color w:val="000000"/>
+        </w:rPr>
+        <w:t>Dependencies, data, design and technical impact are understood.</w:t>
+      </w:r>
+    </w:p>
+    <w:p>
+      <w:pPr>
+        <w:pStyle w:val="ListBullet"/>
+        <w:keepNext w:val="0"/>
+        <w:pageBreakBefore w:val="0"/>
+        <w:spacing w:before="200" w:after="100"/>
+      </w:pPr>
+      <w:r>
+        <w:rPr>
+          <w:b w:val="0"/>
+          <w:color w:val="000000"/>
+        </w:rPr>
+        <w:t>Required synthetic data and development access are available, and no known blocker prevents implementation.</w:t>
+      </w:r>
+    </w:p>
+    <w:p>
+      <w:pPr>
+        <w:keepNext/>
+        <w:pageBreakBefore w:val="0"/>
+        <w:spacing w:before="200" w:after="100"/>
+      </w:pPr>
+      <w:r>
+        <w:rPr>
+          <w:b/>
+          <w:color w:val="000000"/>
+        </w:rPr>
+        <w:t>Definition of Done</w:t>
+      </w:r>
+    </w:p>
+    <w:p>
+      <w:pPr>
         <w:spacing w:after="100" w:line="269" w:lineRule="auto"/>
       </w:pPr>
       <w:r>
-        <w:t>A story is Done only when its stated D1 behavior passes with synthetic data. This does not mean payer integration or the wider product is complete.</w:t>
+        <w:rPr>
+          <w:rFonts w:ascii="Times New Roman" w:hAnsi="Times New Roman"/>
+        </w:rPr>
+        <w:t>A story is Done only after its stated behavior and acceptance criterion pass with synthetic data. Done applies to that story, not to payer integration or the full product.</w:t>
       </w:r>
     </w:p>
     <w:p>
@@ -4732,7 +5142,10 @@
         <w:spacing w:after="100" w:line="269" w:lineRule="auto"/>
       </w:pPr>
       <w:r>
-        <w:t>The proposal uses two-week Scrum sprints with planning, review and retrospective. This increment delivers one vertical slice from claim input to a stored, printable draft. Later sprints should extend that path with payer integration, payment and denial workflows, reporting and measured machine-learning evidence.</w:t>
+        <w:rPr>
+          <w:rFonts w:ascii="Times New Roman" w:hAnsi="Times New Roman"/>
+        </w:rPr>
+        <w:t>We use Scrum sprints with planning, review and retrospective activities, as described in the proposal. The D1 increment covers one complete path from claim input to a stored, printable draft. Later sprints will add user administration, payer integration, payments and denials, reporting and measured machine-learning work.</w:t>
       </w:r>
     </w:p>
     <w:p>
@@ -4755,7 +5168,7 @@
         <w:spacing w:after="40" w:line="252" w:lineRule="auto"/>
       </w:pPr>
       <w:r>
-        <w:t>main contains the published D1 application and aligned submission documentation.</w:t>
+        <w:t>main contains the stable, published application and aligned submission documentation.</w:t>
       </w:r>
     </w:p>
     <w:p>
@@ -4764,7 +5177,7 @@
         <w:spacing w:after="40" w:line="252" w:lineRule="auto"/>
       </w:pPr>
       <w:r>
-        <w:t>Feature and fix branches remain the proposed path for isolated sprint work.</w:t>
+        <w:t>testing is the integration branch for work that is not yet ready for main.</w:t>
       </w:r>
     </w:p>
     <w:p>
@@ -4773,7 +5186,7 @@
         <w:spacing w:after="40" w:line="252" w:lineRule="auto"/>
       </w:pPr>
       <w:r>
-        <w:t>Pull-request review, protected checks and a develop integration branch remain planned team controls.</w:t>
+        <w:t>For subsequent stories, the team will create feature/&lt;story-id&gt; or fix/&lt;issue-id&gt; branches before review and merge.</w:t>
       </w:r>
     </w:p>
     <w:p>
@@ -4795,7 +5208,10 @@
         <w:spacing w:after="100" w:line="269" w:lineRule="auto"/>
       </w:pPr>
       <w:r>
-        <w:t>Planned workflow: refine a story, implement a vertical slice, run lint/build/tests, obtain peer review, demonstrate the deployed behavior and update the report. Current production deployment uses Vercel CLI; automatic GitHub deployment and hosted CI are not enabled.</w:t>
+        <w:rPr>
+          <w:rFonts w:ascii="Times New Roman" w:hAnsi="Times New Roman"/>
+        </w:rPr>
+        <w:t>For each story, we confirm readiness, implement the change on an isolated branch, run lint, build and relevant tests, review the result, merge it and verify the deployed behavior. Vercel deployment and production Playwright checks are working; GitHub Actions and protected branch gates remain planned.</w:t>
       </w:r>
     </w:p>
     <w:p>
@@ -4822,7 +5238,7 @@
           <w:rFonts w:ascii="Times New Roman" w:hAnsi="Times New Roman"/>
           <w:sz w:val="20"/>
         </w:rPr>
-        <w:t>Hasan Abdullah: proposed Scrum Master and backend/AI lead, as listed in the proposal.</w:t>
+        <w:t>Hasan Abdullah serves as Scrum Master and Backend and AI Lead, as assigned in the proposal.</w:t>
       </w:r>
     </w:p>
     <w:p>
@@ -4835,7 +5251,7 @@
           <w:rFonts w:ascii="Times New Roman" w:hAnsi="Times New Roman"/>
           <w:sz w:val="20"/>
         </w:rPr>
-        <w:t>Irfan Saleem: proposed Product Owner and frontend/database lead, as listed in the proposal.</w:t>
+        <w:t>Irfan Saleem serves as Product Owner and Frontend and Database Lead, as assigned in the proposal.</w:t>
       </w:r>
     </w:p>
     <w:p>
@@ -4848,7 +5264,7 @@
           <w:rFonts w:ascii="Times New Roman" w:hAnsi="Times New Roman"/>
           <w:sz w:val="20"/>
         </w:rPr>
-        <w:t>Both students should be able to explain setup, rules, limitations, tests and the live demonstration.</w:t>
+        <w:t>Both members participate in backlog refinement, implementation review, testing and sprint review.</w:t>
       </w:r>
     </w:p>
     <w:p>
@@ -4865,7 +5281,7 @@
           <w:color w:val="1F4E79"/>
           <w:sz w:val="26"/>
         </w:rPr>
-        <w:t>9. CI CD Plan Brief</w:t>
+        <w:t>9. CI/CD Plan (Brief)</w:t>
       </w:r>
     </w:p>
     <w:p>
@@ -4873,7 +5289,10 @@
         <w:spacing w:after="100" w:line="269" w:lineRule="auto"/>
       </w:pPr>
       <w:r>
-        <w:t>Current checks run before manual deployment. Hosted GitHub Actions and protected-branch gates remain planned. Vercel builds the Next.js application, while Playwright verifies the complete user flow against the deployed URL.</w:t>
+        <w:rPr>
+          <w:rFonts w:ascii="Times New Roman" w:hAnsi="Times New Roman"/>
+        </w:rPr>
+        <w:t>Before each manual deployment, we run the local checks. Vercel then builds the Next.js application, and Playwright tests the full workflow against the deployed URL. GitHub Actions and protected branch gates are planned for a later release.</w:t>
       </w:r>
     </w:p>
     <w:tbl>
@@ -5201,7 +5620,7 @@
           <w:color w:val="1F4E79"/>
           <w:sz w:val="26"/>
         </w:rPr>
-        <w:t>10. Next Steps Semester 8</w:t>
+        <w:t>10. Next Steps (Semester 8)</w:t>
       </w:r>
     </w:p>
     <w:tbl>
@@ -5282,7 +5701,7 @@
           </w:tcPr>
           <w:p>
             <w:r>
-              <w:t>Scope review</w:t>
+              <w:t>D1 feedback</w:t>
             </w:r>
           </w:p>
         </w:tc>
@@ -5299,7 +5718,7 @@
           </w:tcPr>
           <w:p>
             <w:r>
-              <w:t>Confirm the D1 claim-intake, validation and preview slice against the proposal.</w:t>
+              <w:t>Review the evaluation feedback and update the prioritized backlog before the next sprint.</w:t>
             </w:r>
           </w:p>
         </w:tc>
@@ -5511,7 +5930,10 @@
         <w:spacing w:after="100" w:line="269" w:lineRule="auto"/>
       </w:pPr>
       <w:r>
-        <w:t>Demonstrate the complete D1 claim-intake slice and request supervisor confirmation that this is the correct first increment. The next work should add official claim export or submission requirements, eligibility and code lookup, payments and denials, reconciled financial reports, and a properly evaluated denial-risk model.</w:t>
+        <w:rPr>
+          <w:rFonts w:ascii="Times New Roman" w:hAnsi="Times New Roman"/>
+        </w:rPr>
+        <w:t>Semester 8 work will extend the demonstrated claim-intake increment in prioritized sprints. Planned work includes user and master-data administration, patient and policy management, official code and eligibility services, payer submission requirements, payments and denials, financial reports, a measured denial-risk experiment, hosted CI and production monitoring.</w:t>
       </w:r>
     </w:p>
     <w:sectPr>
@@ -5688,7 +6110,7 @@
               <w:t xml:space="preserve"> of </w:t>
             </w:r>
             <w:r>
-              <w:t>9</w:t>
+              <w:t>10</w:t>
             </w:r>
           </w:p>
         </w:sdtContent>

</xml_diff>